<commit_message>
docs(thesis): proofreading: no project-schedule references; Chapter 1 final
Chapter 1's contributions state the final results instead of pending
ones; every "Week N" reference across Chapters 1 and 3 to 6 became a
section reference or neutral wording; internal terms (gate, shortcut)
replaced. Every parenthesised section reference resolves. thesis.docx
and thesis.pdf rebuilt.

Co-Authored-By: Claude Opus 5.5 <noreply@anthropic.com>
</commit_message>
<xml_diff>
--- a/docs/thesis/thesis.docx
+++ b/docs/thesis/thesis.docx
@@ -86,7 +86,7 @@
         <w:pStyle w:val="Heading1"/>
       </w:pPr>
       <w:bookmarkStart w:id="0" w:name="acknowledgments"/>
-      <w:bookmarkStart w:id="1" w:name="_Toc243780849"/>
+      <w:bookmarkStart w:id="1" w:name="_Toc243780978"/>
       <w:r>
         <w:lastRenderedPageBreak/>
         <w:t>Acknowledgments</w:t>
@@ -123,7 +123,7 @@
         <w:pStyle w:val="Heading1"/>
       </w:pPr>
       <w:bookmarkStart w:id="2" w:name="abstract"/>
-      <w:bookmarkStart w:id="3" w:name="_Toc243780850"/>
+      <w:bookmarkStart w:id="3" w:name="_Toc243780979"/>
       <w:bookmarkEnd w:id="0"/>
       <w:r>
         <w:t>Abstract</w:t>
@@ -324,7 +324,7 @@
         <w:pStyle w:val="Heading1"/>
       </w:pPr>
       <w:bookmarkStart w:id="4" w:name="tóm-tắt"/>
-      <w:bookmarkStart w:id="5" w:name="_Toc243780851"/>
+      <w:bookmarkStart w:id="5" w:name="_Toc243780980"/>
       <w:bookmarkEnd w:id="2"/>
       <w:r>
         <w:lastRenderedPageBreak/>
@@ -2175,7 +2175,7 @@
         <w:pStyle w:val="Heading1"/>
       </w:pPr>
       <w:bookmarkStart w:id="6" w:name="abbreviations"/>
-      <w:bookmarkStart w:id="7" w:name="_Toc243780852"/>
+      <w:bookmarkStart w:id="7" w:name="_Toc243780981"/>
       <w:bookmarkEnd w:id="4"/>
       <w:r>
         <w:t>Abbreviations</w:t>
@@ -2578,7 +2578,7 @@
     </w:p>
     <w:sdt>
       <w:sdtPr>
-        <w:id w:val="1932459235"/>
+        <w:id w:val="1836340294"/>
         <w:docPartObj>
           <w:docPartGallery w:val="Table of Contents"/>
           <w:docPartUnique/>
@@ -2608,7 +2608,7 @@
           <w:r>
             <w:fldChar w:fldCharType="separate"/>
           </w:r>
-          <w:hyperlink w:anchor="_Toc243780849" w:history="1">
+          <w:hyperlink w:anchor="_Toc243780978" w:history="1">
             <w:r>
               <w:rPr>
                 <w:rStyle w:val="Hyperlink"/>
@@ -2635,7 +2635,7 @@
                 <w:noProof/>
                 <w:webHidden/>
               </w:rPr>
-              <w:instrText xml:space="preserve"> PAGEREF _Toc243780849 \h </w:instrText>
+              <w:instrText xml:space="preserve"> PAGEREF _Toc243780978 \h </w:instrText>
             </w:r>
             <w:r>
               <w:rPr>
@@ -2679,7 +2679,7 @@
               <w14:ligatures w14:val="standardContextual"/>
             </w:rPr>
           </w:pPr>
-          <w:hyperlink w:anchor="_Toc243780850" w:history="1">
+          <w:hyperlink w:anchor="_Toc243780979" w:history="1">
             <w:r>
               <w:rPr>
                 <w:rStyle w:val="Hyperlink"/>
@@ -2706,7 +2706,7 @@
                 <w:noProof/>
                 <w:webHidden/>
               </w:rPr>
-              <w:instrText xml:space="preserve"> PAGEREF _Toc243780850 \h </w:instrText>
+              <w:instrText xml:space="preserve"> PAGEREF _Toc243780979 \h </w:instrText>
             </w:r>
             <w:r>
               <w:rPr>
@@ -2750,7 +2750,7 @@
               <w14:ligatures w14:val="standardContextual"/>
             </w:rPr>
           </w:pPr>
-          <w:hyperlink w:anchor="_Toc243780851" w:history="1">
+          <w:hyperlink w:anchor="_Toc243780980" w:history="1">
             <w:r>
               <w:rPr>
                 <w:rStyle w:val="Hyperlink"/>
@@ -2777,7 +2777,7 @@
                 <w:noProof/>
                 <w:webHidden/>
               </w:rPr>
-              <w:instrText xml:space="preserve"> PAGEREF _Toc243780851 \h </w:instrText>
+              <w:instrText xml:space="preserve"> PAGEREF _Toc243780980 \h </w:instrText>
             </w:r>
             <w:r>
               <w:rPr>
@@ -2821,7 +2821,7 @@
               <w14:ligatures w14:val="standardContextual"/>
             </w:rPr>
           </w:pPr>
-          <w:hyperlink w:anchor="_Toc243780852" w:history="1">
+          <w:hyperlink w:anchor="_Toc243780981" w:history="1">
             <w:r>
               <w:rPr>
                 <w:rStyle w:val="Hyperlink"/>
@@ -2848,7 +2848,7 @@
                 <w:noProof/>
                 <w:webHidden/>
               </w:rPr>
-              <w:instrText xml:space="preserve"> PAGEREF _Toc243780852 \h </w:instrText>
+              <w:instrText xml:space="preserve"> PAGEREF _Toc243780981 \h </w:instrText>
             </w:r>
             <w:r>
               <w:rPr>
@@ -2892,7 +2892,7 @@
               <w14:ligatures w14:val="standardContextual"/>
             </w:rPr>
           </w:pPr>
-          <w:hyperlink w:anchor="_Toc243780853" w:history="1">
+          <w:hyperlink w:anchor="_Toc243780982" w:history="1">
             <w:r>
               <w:rPr>
                 <w:rStyle w:val="Hyperlink"/>
@@ -2919,7 +2919,7 @@
                 <w:noProof/>
                 <w:webHidden/>
               </w:rPr>
-              <w:instrText xml:space="preserve"> PAGEREF _Toc243780853 \h </w:instrText>
+              <w:instrText xml:space="preserve"> PAGEREF _Toc243780982 \h </w:instrText>
             </w:r>
             <w:r>
               <w:rPr>
@@ -2963,7 +2963,7 @@
               <w14:ligatures w14:val="standardContextual"/>
             </w:rPr>
           </w:pPr>
-          <w:hyperlink w:anchor="_Toc243780854" w:history="1">
+          <w:hyperlink w:anchor="_Toc243780983" w:history="1">
             <w:r>
               <w:rPr>
                 <w:rStyle w:val="Hyperlink"/>
@@ -2990,7 +2990,7 @@
                 <w:noProof/>
                 <w:webHidden/>
               </w:rPr>
-              <w:instrText xml:space="preserve"> PAGEREF _Toc243780854 \h </w:instrText>
+              <w:instrText xml:space="preserve"> PAGEREF _Toc243780983 \h </w:instrText>
             </w:r>
             <w:r>
               <w:rPr>
@@ -3034,7 +3034,7 @@
               <w14:ligatures w14:val="standardContextual"/>
             </w:rPr>
           </w:pPr>
-          <w:hyperlink w:anchor="_Toc243780855" w:history="1">
+          <w:hyperlink w:anchor="_Toc243780984" w:history="1">
             <w:r>
               <w:rPr>
                 <w:rStyle w:val="Hyperlink"/>
@@ -3061,7 +3061,7 @@
                 <w:noProof/>
                 <w:webHidden/>
               </w:rPr>
-              <w:instrText xml:space="preserve"> PAGEREF _Toc243780855 \h </w:instrText>
+              <w:instrText xml:space="preserve"> PAGEREF _Toc243780984 \h </w:instrText>
             </w:r>
             <w:r>
               <w:rPr>
@@ -3105,7 +3105,7 @@
               <w14:ligatures w14:val="standardContextual"/>
             </w:rPr>
           </w:pPr>
-          <w:hyperlink w:anchor="_Toc243780856" w:history="1">
+          <w:hyperlink w:anchor="_Toc243780985" w:history="1">
             <w:r>
               <w:rPr>
                 <w:rStyle w:val="Hyperlink"/>
@@ -3132,7 +3132,7 @@
                 <w:noProof/>
                 <w:webHidden/>
               </w:rPr>
-              <w:instrText xml:space="preserve"> PAGEREF _Toc243780856 \h </w:instrText>
+              <w:instrText xml:space="preserve"> PAGEREF _Toc243780985 \h </w:instrText>
             </w:r>
             <w:r>
               <w:rPr>
@@ -3176,7 +3176,7 @@
               <w14:ligatures w14:val="standardContextual"/>
             </w:rPr>
           </w:pPr>
-          <w:hyperlink w:anchor="_Toc243780857" w:history="1">
+          <w:hyperlink w:anchor="_Toc243780986" w:history="1">
             <w:r>
               <w:rPr>
                 <w:rStyle w:val="Hyperlink"/>
@@ -3203,7 +3203,7 @@
                 <w:noProof/>
                 <w:webHidden/>
               </w:rPr>
-              <w:instrText xml:space="preserve"> PAGEREF _Toc243780857 \h </w:instrText>
+              <w:instrText xml:space="preserve"> PAGEREF _Toc243780986 \h </w:instrText>
             </w:r>
             <w:r>
               <w:rPr>
@@ -3247,7 +3247,7 @@
               <w14:ligatures w14:val="standardContextual"/>
             </w:rPr>
           </w:pPr>
-          <w:hyperlink w:anchor="_Toc243780858" w:history="1">
+          <w:hyperlink w:anchor="_Toc243780987" w:history="1">
             <w:r>
               <w:rPr>
                 <w:rStyle w:val="Hyperlink"/>
@@ -3274,7 +3274,7 @@
                 <w:noProof/>
                 <w:webHidden/>
               </w:rPr>
-              <w:instrText xml:space="preserve"> PAGEREF _Toc243780858 \h </w:instrText>
+              <w:instrText xml:space="preserve"> PAGEREF _Toc243780987 \h </w:instrText>
             </w:r>
             <w:r>
               <w:rPr>
@@ -3318,7 +3318,7 @@
               <w14:ligatures w14:val="standardContextual"/>
             </w:rPr>
           </w:pPr>
-          <w:hyperlink w:anchor="_Toc243780859" w:history="1">
+          <w:hyperlink w:anchor="_Toc243780988" w:history="1">
             <w:r>
               <w:rPr>
                 <w:rStyle w:val="Hyperlink"/>
@@ -3345,7 +3345,7 @@
                 <w:noProof/>
                 <w:webHidden/>
               </w:rPr>
-              <w:instrText xml:space="preserve"> PAGEREF _Toc243780859 \h </w:instrText>
+              <w:instrText xml:space="preserve"> PAGEREF _Toc243780988 \h </w:instrText>
             </w:r>
             <w:r>
               <w:rPr>
@@ -3389,7 +3389,7 @@
               <w14:ligatures w14:val="standardContextual"/>
             </w:rPr>
           </w:pPr>
-          <w:hyperlink w:anchor="_Toc243780860" w:history="1">
+          <w:hyperlink w:anchor="_Toc243780989" w:history="1">
             <w:r>
               <w:rPr>
                 <w:rStyle w:val="Hyperlink"/>
@@ -3416,7 +3416,7 @@
                 <w:noProof/>
                 <w:webHidden/>
               </w:rPr>
-              <w:instrText xml:space="preserve"> PAGEREF _Toc243780860 \h </w:instrText>
+              <w:instrText xml:space="preserve"> PAGEREF _Toc243780989 \h </w:instrText>
             </w:r>
             <w:r>
               <w:rPr>
@@ -3460,7 +3460,7 @@
               <w14:ligatures w14:val="standardContextual"/>
             </w:rPr>
           </w:pPr>
-          <w:hyperlink w:anchor="_Toc243780861" w:history="1">
+          <w:hyperlink w:anchor="_Toc243780990" w:history="1">
             <w:r>
               <w:rPr>
                 <w:rStyle w:val="Hyperlink"/>
@@ -3487,7 +3487,7 @@
                 <w:noProof/>
                 <w:webHidden/>
               </w:rPr>
-              <w:instrText xml:space="preserve"> PAGEREF _Toc243780861 \h </w:instrText>
+              <w:instrText xml:space="preserve"> PAGEREF _Toc243780990 \h </w:instrText>
             </w:r>
             <w:r>
               <w:rPr>
@@ -3531,7 +3531,7 @@
               <w14:ligatures w14:val="standardContextual"/>
             </w:rPr>
           </w:pPr>
-          <w:hyperlink w:anchor="_Toc243780862" w:history="1">
+          <w:hyperlink w:anchor="_Toc243780991" w:history="1">
             <w:r>
               <w:rPr>
                 <w:rStyle w:val="Hyperlink"/>
@@ -3558,7 +3558,7 @@
                 <w:noProof/>
                 <w:webHidden/>
               </w:rPr>
-              <w:instrText xml:space="preserve"> PAGEREF _Toc243780862 \h </w:instrText>
+              <w:instrText xml:space="preserve"> PAGEREF _Toc243780991 \h </w:instrText>
             </w:r>
             <w:r>
               <w:rPr>
@@ -3602,7 +3602,7 @@
               <w14:ligatures w14:val="standardContextual"/>
             </w:rPr>
           </w:pPr>
-          <w:hyperlink w:anchor="_Toc243780863" w:history="1">
+          <w:hyperlink w:anchor="_Toc243780992" w:history="1">
             <w:r>
               <w:rPr>
                 <w:rStyle w:val="Hyperlink"/>
@@ -3629,7 +3629,7 @@
                 <w:noProof/>
                 <w:webHidden/>
               </w:rPr>
-              <w:instrText xml:space="preserve"> PAGEREF _Toc243780863 \h </w:instrText>
+              <w:instrText xml:space="preserve"> PAGEREF _Toc243780992 \h </w:instrText>
             </w:r>
             <w:r>
               <w:rPr>
@@ -3673,7 +3673,7 @@
               <w14:ligatures w14:val="standardContextual"/>
             </w:rPr>
           </w:pPr>
-          <w:hyperlink w:anchor="_Toc243780864" w:history="1">
+          <w:hyperlink w:anchor="_Toc243780993" w:history="1">
             <w:r>
               <w:rPr>
                 <w:rStyle w:val="Hyperlink"/>
@@ -3700,7 +3700,7 @@
                 <w:noProof/>
                 <w:webHidden/>
               </w:rPr>
-              <w:instrText xml:space="preserve"> PAGEREF _Toc243780864 \h </w:instrText>
+              <w:instrText xml:space="preserve"> PAGEREF _Toc243780993 \h </w:instrText>
             </w:r>
             <w:r>
               <w:rPr>
@@ -3744,7 +3744,7 @@
               <w14:ligatures w14:val="standardContextual"/>
             </w:rPr>
           </w:pPr>
-          <w:hyperlink w:anchor="_Toc243780865" w:history="1">
+          <w:hyperlink w:anchor="_Toc243780994" w:history="1">
             <w:r>
               <w:rPr>
                 <w:rStyle w:val="Hyperlink"/>
@@ -3771,7 +3771,7 @@
                 <w:noProof/>
                 <w:webHidden/>
               </w:rPr>
-              <w:instrText xml:space="preserve"> PAGEREF _Toc243780865 \h </w:instrText>
+              <w:instrText xml:space="preserve"> PAGEREF _Toc243780994 \h </w:instrText>
             </w:r>
             <w:r>
               <w:rPr>
@@ -3815,7 +3815,7 @@
               <w14:ligatures w14:val="standardContextual"/>
             </w:rPr>
           </w:pPr>
-          <w:hyperlink w:anchor="_Toc243780866" w:history="1">
+          <w:hyperlink w:anchor="_Toc243780995" w:history="1">
             <w:r>
               <w:rPr>
                 <w:rStyle w:val="Hyperlink"/>
@@ -3842,7 +3842,7 @@
                 <w:noProof/>
                 <w:webHidden/>
               </w:rPr>
-              <w:instrText xml:space="preserve"> PAGEREF _Toc243780866 \h </w:instrText>
+              <w:instrText xml:space="preserve"> PAGEREF _Toc243780995 \h </w:instrText>
             </w:r>
             <w:r>
               <w:rPr>
@@ -3886,7 +3886,7 @@
               <w14:ligatures w14:val="standardContextual"/>
             </w:rPr>
           </w:pPr>
-          <w:hyperlink w:anchor="_Toc243780867" w:history="1">
+          <w:hyperlink w:anchor="_Toc243780996" w:history="1">
             <w:r>
               <w:rPr>
                 <w:rStyle w:val="Hyperlink"/>
@@ -3913,7 +3913,7 @@
                 <w:noProof/>
                 <w:webHidden/>
               </w:rPr>
-              <w:instrText xml:space="preserve"> PAGEREF _Toc243780867 \h </w:instrText>
+              <w:instrText xml:space="preserve"> PAGEREF _Toc243780996 \h </w:instrText>
             </w:r>
             <w:r>
               <w:rPr>
@@ -3957,7 +3957,7 @@
               <w14:ligatures w14:val="standardContextual"/>
             </w:rPr>
           </w:pPr>
-          <w:hyperlink w:anchor="_Toc243780868" w:history="1">
+          <w:hyperlink w:anchor="_Toc243780997" w:history="1">
             <w:r>
               <w:rPr>
                 <w:rStyle w:val="Hyperlink"/>
@@ -3984,7 +3984,7 @@
                 <w:noProof/>
                 <w:webHidden/>
               </w:rPr>
-              <w:instrText xml:space="preserve"> PAGEREF _Toc243780868 \h </w:instrText>
+              <w:instrText xml:space="preserve"> PAGEREF _Toc243780997 \h </w:instrText>
             </w:r>
             <w:r>
               <w:rPr>
@@ -4028,7 +4028,7 @@
               <w14:ligatures w14:val="standardContextual"/>
             </w:rPr>
           </w:pPr>
-          <w:hyperlink w:anchor="_Toc243780869" w:history="1">
+          <w:hyperlink w:anchor="_Toc243780998" w:history="1">
             <w:r>
               <w:rPr>
                 <w:rStyle w:val="Hyperlink"/>
@@ -4055,7 +4055,7 @@
                 <w:noProof/>
                 <w:webHidden/>
               </w:rPr>
-              <w:instrText xml:space="preserve"> PAGEREF _Toc243780869 \h </w:instrText>
+              <w:instrText xml:space="preserve"> PAGEREF _Toc243780998 \h </w:instrText>
             </w:r>
             <w:r>
               <w:rPr>
@@ -4099,7 +4099,7 @@
               <w14:ligatures w14:val="standardContextual"/>
             </w:rPr>
           </w:pPr>
-          <w:hyperlink w:anchor="_Toc243780870" w:history="1">
+          <w:hyperlink w:anchor="_Toc243780999" w:history="1">
             <w:r>
               <w:rPr>
                 <w:rStyle w:val="Hyperlink"/>
@@ -4126,7 +4126,7 @@
                 <w:noProof/>
                 <w:webHidden/>
               </w:rPr>
-              <w:instrText xml:space="preserve"> PAGEREF _Toc243780870 \h </w:instrText>
+              <w:instrText xml:space="preserve"> PAGEREF _Toc243780999 \h </w:instrText>
             </w:r>
             <w:r>
               <w:rPr>
@@ -4170,7 +4170,7 @@
               <w14:ligatures w14:val="standardContextual"/>
             </w:rPr>
           </w:pPr>
-          <w:hyperlink w:anchor="_Toc243780871" w:history="1">
+          <w:hyperlink w:anchor="_Toc243781000" w:history="1">
             <w:r>
               <w:rPr>
                 <w:rStyle w:val="Hyperlink"/>
@@ -4197,7 +4197,7 @@
                 <w:noProof/>
                 <w:webHidden/>
               </w:rPr>
-              <w:instrText xml:space="preserve"> PAGEREF _Toc243780871 \h </w:instrText>
+              <w:instrText xml:space="preserve"> PAGEREF _Toc243781000 \h </w:instrText>
             </w:r>
             <w:r>
               <w:rPr>
@@ -4241,7 +4241,7 @@
               <w14:ligatures w14:val="standardContextual"/>
             </w:rPr>
           </w:pPr>
-          <w:hyperlink w:anchor="_Toc243780872" w:history="1">
+          <w:hyperlink w:anchor="_Toc243781001" w:history="1">
             <w:r>
               <w:rPr>
                 <w:rStyle w:val="Hyperlink"/>
@@ -4268,7 +4268,7 @@
                 <w:noProof/>
                 <w:webHidden/>
               </w:rPr>
-              <w:instrText xml:space="preserve"> PAGEREF _Toc243780872 \h </w:instrText>
+              <w:instrText xml:space="preserve"> PAGEREF _Toc243781001 \h </w:instrText>
             </w:r>
             <w:r>
               <w:rPr>
@@ -4312,7 +4312,7 @@
               <w14:ligatures w14:val="standardContextual"/>
             </w:rPr>
           </w:pPr>
-          <w:hyperlink w:anchor="_Toc243780873" w:history="1">
+          <w:hyperlink w:anchor="_Toc243781002" w:history="1">
             <w:r>
               <w:rPr>
                 <w:rStyle w:val="Hyperlink"/>
@@ -4339,7 +4339,7 @@
                 <w:noProof/>
                 <w:webHidden/>
               </w:rPr>
-              <w:instrText xml:space="preserve"> PAGEREF _Toc243780873 \h </w:instrText>
+              <w:instrText xml:space="preserve"> PAGEREF _Toc243781002 \h </w:instrText>
             </w:r>
             <w:r>
               <w:rPr>
@@ -4383,7 +4383,7 @@
               <w14:ligatures w14:val="standardContextual"/>
             </w:rPr>
           </w:pPr>
-          <w:hyperlink w:anchor="_Toc243780874" w:history="1">
+          <w:hyperlink w:anchor="_Toc243781003" w:history="1">
             <w:r>
               <w:rPr>
                 <w:rStyle w:val="Hyperlink"/>
@@ -4410,7 +4410,7 @@
                 <w:noProof/>
                 <w:webHidden/>
               </w:rPr>
-              <w:instrText xml:space="preserve"> PAGEREF _Toc243780874 \h </w:instrText>
+              <w:instrText xml:space="preserve"> PAGEREF _Toc243781003 \h </w:instrText>
             </w:r>
             <w:r>
               <w:rPr>
@@ -4454,7 +4454,7 @@
               <w14:ligatures w14:val="standardContextual"/>
             </w:rPr>
           </w:pPr>
-          <w:hyperlink w:anchor="_Toc243780875" w:history="1">
+          <w:hyperlink w:anchor="_Toc243781004" w:history="1">
             <w:r>
               <w:rPr>
                 <w:rStyle w:val="Hyperlink"/>
@@ -4481,7 +4481,7 @@
                 <w:noProof/>
                 <w:webHidden/>
               </w:rPr>
-              <w:instrText xml:space="preserve"> PAGEREF _Toc243780875 \h </w:instrText>
+              <w:instrText xml:space="preserve"> PAGEREF _Toc243781004 \h </w:instrText>
             </w:r>
             <w:r>
               <w:rPr>
@@ -4525,7 +4525,7 @@
               <w14:ligatures w14:val="standardContextual"/>
             </w:rPr>
           </w:pPr>
-          <w:hyperlink w:anchor="_Toc243780876" w:history="1">
+          <w:hyperlink w:anchor="_Toc243781005" w:history="1">
             <w:r>
               <w:rPr>
                 <w:rStyle w:val="Hyperlink"/>
@@ -4552,7 +4552,7 @@
                 <w:noProof/>
                 <w:webHidden/>
               </w:rPr>
-              <w:instrText xml:space="preserve"> PAGEREF _Toc243780876 \h </w:instrText>
+              <w:instrText xml:space="preserve"> PAGEREF _Toc243781005 \h </w:instrText>
             </w:r>
             <w:r>
               <w:rPr>
@@ -4596,7 +4596,7 @@
               <w14:ligatures w14:val="standardContextual"/>
             </w:rPr>
           </w:pPr>
-          <w:hyperlink w:anchor="_Toc243780877" w:history="1">
+          <w:hyperlink w:anchor="_Toc243781006" w:history="1">
             <w:r>
               <w:rPr>
                 <w:rStyle w:val="Hyperlink"/>
@@ -4623,7 +4623,7 @@
                 <w:noProof/>
                 <w:webHidden/>
               </w:rPr>
-              <w:instrText xml:space="preserve"> PAGEREF _Toc243780877 \h </w:instrText>
+              <w:instrText xml:space="preserve"> PAGEREF _Toc243781006 \h </w:instrText>
             </w:r>
             <w:r>
               <w:rPr>
@@ -4667,7 +4667,7 @@
               <w14:ligatures w14:val="standardContextual"/>
             </w:rPr>
           </w:pPr>
-          <w:hyperlink w:anchor="_Toc243780878" w:history="1">
+          <w:hyperlink w:anchor="_Toc243781007" w:history="1">
             <w:r>
               <w:rPr>
                 <w:rStyle w:val="Hyperlink"/>
@@ -4694,7 +4694,7 @@
                 <w:noProof/>
                 <w:webHidden/>
               </w:rPr>
-              <w:instrText xml:space="preserve"> PAGEREF _Toc243780878 \h </w:instrText>
+              <w:instrText xml:space="preserve"> PAGEREF _Toc243781007 \h </w:instrText>
             </w:r>
             <w:r>
               <w:rPr>
@@ -4738,7 +4738,7 @@
               <w14:ligatures w14:val="standardContextual"/>
             </w:rPr>
           </w:pPr>
-          <w:hyperlink w:anchor="_Toc243780879" w:history="1">
+          <w:hyperlink w:anchor="_Toc243781008" w:history="1">
             <w:r>
               <w:rPr>
                 <w:rStyle w:val="Hyperlink"/>
@@ -4765,7 +4765,7 @@
                 <w:noProof/>
                 <w:webHidden/>
               </w:rPr>
-              <w:instrText xml:space="preserve"> PAGEREF _Toc243780879 \h </w:instrText>
+              <w:instrText xml:space="preserve"> PAGEREF _Toc243781008 \h </w:instrText>
             </w:r>
             <w:r>
               <w:rPr>
@@ -4809,7 +4809,7 @@
               <w14:ligatures w14:val="standardContextual"/>
             </w:rPr>
           </w:pPr>
-          <w:hyperlink w:anchor="_Toc243780880" w:history="1">
+          <w:hyperlink w:anchor="_Toc243781009" w:history="1">
             <w:r>
               <w:rPr>
                 <w:rStyle w:val="Hyperlink"/>
@@ -4836,7 +4836,7 @@
                 <w:noProof/>
                 <w:webHidden/>
               </w:rPr>
-              <w:instrText xml:space="preserve"> PAGEREF _Toc243780880 \h </w:instrText>
+              <w:instrText xml:space="preserve"> PAGEREF _Toc243781009 \h </w:instrText>
             </w:r>
             <w:r>
               <w:rPr>
@@ -4880,7 +4880,7 @@
               <w14:ligatures w14:val="standardContextual"/>
             </w:rPr>
           </w:pPr>
-          <w:hyperlink w:anchor="_Toc243780881" w:history="1">
+          <w:hyperlink w:anchor="_Toc243781010" w:history="1">
             <w:r>
               <w:rPr>
                 <w:rStyle w:val="Hyperlink"/>
@@ -4907,7 +4907,7 @@
                 <w:noProof/>
                 <w:webHidden/>
               </w:rPr>
-              <w:instrText xml:space="preserve"> PAGEREF _Toc243780881 \h </w:instrText>
+              <w:instrText xml:space="preserve"> PAGEREF _Toc243781010 \h </w:instrText>
             </w:r>
             <w:r>
               <w:rPr>
@@ -4951,7 +4951,7 @@
               <w14:ligatures w14:val="standardContextual"/>
             </w:rPr>
           </w:pPr>
-          <w:hyperlink w:anchor="_Toc243780882" w:history="1">
+          <w:hyperlink w:anchor="_Toc243781011" w:history="1">
             <w:r>
               <w:rPr>
                 <w:rStyle w:val="Hyperlink"/>
@@ -4978,7 +4978,7 @@
                 <w:noProof/>
                 <w:webHidden/>
               </w:rPr>
-              <w:instrText xml:space="preserve"> PAGEREF _Toc243780882 \h </w:instrText>
+              <w:instrText xml:space="preserve"> PAGEREF _Toc243781011 \h </w:instrText>
             </w:r>
             <w:r>
               <w:rPr>
@@ -5022,7 +5022,7 @@
               <w14:ligatures w14:val="standardContextual"/>
             </w:rPr>
           </w:pPr>
-          <w:hyperlink w:anchor="_Toc243780883" w:history="1">
+          <w:hyperlink w:anchor="_Toc243781012" w:history="1">
             <w:r>
               <w:rPr>
                 <w:rStyle w:val="Hyperlink"/>
@@ -5049,7 +5049,7 @@
                 <w:noProof/>
                 <w:webHidden/>
               </w:rPr>
-              <w:instrText xml:space="preserve"> PAGEREF _Toc243780883 \h </w:instrText>
+              <w:instrText xml:space="preserve"> PAGEREF _Toc243781012 \h </w:instrText>
             </w:r>
             <w:r>
               <w:rPr>
@@ -5093,7 +5093,7 @@
               <w14:ligatures w14:val="standardContextual"/>
             </w:rPr>
           </w:pPr>
-          <w:hyperlink w:anchor="_Toc243780884" w:history="1">
+          <w:hyperlink w:anchor="_Toc243781013" w:history="1">
             <w:r>
               <w:rPr>
                 <w:rStyle w:val="Hyperlink"/>
@@ -5120,7 +5120,7 @@
                 <w:noProof/>
                 <w:webHidden/>
               </w:rPr>
-              <w:instrText xml:space="preserve"> PAGEREF _Toc243780884 \h </w:instrText>
+              <w:instrText xml:space="preserve"> PAGEREF _Toc243781013 \h </w:instrText>
             </w:r>
             <w:r>
               <w:rPr>
@@ -5164,7 +5164,7 @@
               <w14:ligatures w14:val="standardContextual"/>
             </w:rPr>
           </w:pPr>
-          <w:hyperlink w:anchor="_Toc243780885" w:history="1">
+          <w:hyperlink w:anchor="_Toc243781014" w:history="1">
             <w:r>
               <w:rPr>
                 <w:rStyle w:val="Hyperlink"/>
@@ -5191,7 +5191,7 @@
                 <w:noProof/>
                 <w:webHidden/>
               </w:rPr>
-              <w:instrText xml:space="preserve"> PAGEREF _Toc243780885 \h </w:instrText>
+              <w:instrText xml:space="preserve"> PAGEREF _Toc243781014 \h </w:instrText>
             </w:r>
             <w:r>
               <w:rPr>
@@ -5235,7 +5235,7 @@
               <w14:ligatures w14:val="standardContextual"/>
             </w:rPr>
           </w:pPr>
-          <w:hyperlink w:anchor="_Toc243780886" w:history="1">
+          <w:hyperlink w:anchor="_Toc243781015" w:history="1">
             <w:r>
               <w:rPr>
                 <w:rStyle w:val="Hyperlink"/>
@@ -5262,7 +5262,7 @@
                 <w:noProof/>
                 <w:webHidden/>
               </w:rPr>
-              <w:instrText xml:space="preserve"> PAGEREF _Toc243780886 \h </w:instrText>
+              <w:instrText xml:space="preserve"> PAGEREF _Toc243781015 \h </w:instrText>
             </w:r>
             <w:r>
               <w:rPr>
@@ -5306,7 +5306,7 @@
               <w14:ligatures w14:val="standardContextual"/>
             </w:rPr>
           </w:pPr>
-          <w:hyperlink w:anchor="_Toc243780887" w:history="1">
+          <w:hyperlink w:anchor="_Toc243781016" w:history="1">
             <w:r>
               <w:rPr>
                 <w:rStyle w:val="Hyperlink"/>
@@ -5333,7 +5333,7 @@
                 <w:noProof/>
                 <w:webHidden/>
               </w:rPr>
-              <w:instrText xml:space="preserve"> PAGEREF _Toc243780887 \h </w:instrText>
+              <w:instrText xml:space="preserve"> PAGEREF _Toc243781016 \h </w:instrText>
             </w:r>
             <w:r>
               <w:rPr>
@@ -5377,7 +5377,7 @@
               <w14:ligatures w14:val="standardContextual"/>
             </w:rPr>
           </w:pPr>
-          <w:hyperlink w:anchor="_Toc243780888" w:history="1">
+          <w:hyperlink w:anchor="_Toc243781017" w:history="1">
             <w:r>
               <w:rPr>
                 <w:rStyle w:val="Hyperlink"/>
@@ -5404,7 +5404,7 @@
                 <w:noProof/>
                 <w:webHidden/>
               </w:rPr>
-              <w:instrText xml:space="preserve"> PAGEREF _Toc243780888 \h </w:instrText>
+              <w:instrText xml:space="preserve"> PAGEREF _Toc243781017 \h </w:instrText>
             </w:r>
             <w:r>
               <w:rPr>
@@ -5448,7 +5448,7 @@
               <w14:ligatures w14:val="standardContextual"/>
             </w:rPr>
           </w:pPr>
-          <w:hyperlink w:anchor="_Toc243780889" w:history="1">
+          <w:hyperlink w:anchor="_Toc243781018" w:history="1">
             <w:r>
               <w:rPr>
                 <w:rStyle w:val="Hyperlink"/>
@@ -5475,7 +5475,7 @@
                 <w:noProof/>
                 <w:webHidden/>
               </w:rPr>
-              <w:instrText xml:space="preserve"> PAGEREF _Toc243780889 \h </w:instrText>
+              <w:instrText xml:space="preserve"> PAGEREF _Toc243781018 \h </w:instrText>
             </w:r>
             <w:r>
               <w:rPr>
@@ -5519,7 +5519,7 @@
               <w14:ligatures w14:val="standardContextual"/>
             </w:rPr>
           </w:pPr>
-          <w:hyperlink w:anchor="_Toc243780890" w:history="1">
+          <w:hyperlink w:anchor="_Toc243781019" w:history="1">
             <w:r>
               <w:rPr>
                 <w:rStyle w:val="Hyperlink"/>
@@ -5546,7 +5546,7 @@
                 <w:noProof/>
                 <w:webHidden/>
               </w:rPr>
-              <w:instrText xml:space="preserve"> PAGEREF _Toc243780890 \h </w:instrText>
+              <w:instrText xml:space="preserve"> PAGEREF _Toc243781019 \h </w:instrText>
             </w:r>
             <w:r>
               <w:rPr>
@@ -5590,7 +5590,7 @@
               <w14:ligatures w14:val="standardContextual"/>
             </w:rPr>
           </w:pPr>
-          <w:hyperlink w:anchor="_Toc243780891" w:history="1">
+          <w:hyperlink w:anchor="_Toc243781020" w:history="1">
             <w:r>
               <w:rPr>
                 <w:rStyle w:val="Hyperlink"/>
@@ -5617,7 +5617,7 @@
                 <w:noProof/>
                 <w:webHidden/>
               </w:rPr>
-              <w:instrText xml:space="preserve"> PAGEREF _Toc243780891 \h </w:instrText>
+              <w:instrText xml:space="preserve"> PAGEREF _Toc243781020 \h </w:instrText>
             </w:r>
             <w:r>
               <w:rPr>
@@ -5661,7 +5661,7 @@
               <w14:ligatures w14:val="standardContextual"/>
             </w:rPr>
           </w:pPr>
-          <w:hyperlink w:anchor="_Toc243780892" w:history="1">
+          <w:hyperlink w:anchor="_Toc243781021" w:history="1">
             <w:r>
               <w:rPr>
                 <w:rStyle w:val="Hyperlink"/>
@@ -5688,7 +5688,7 @@
                 <w:noProof/>
                 <w:webHidden/>
               </w:rPr>
-              <w:instrText xml:space="preserve"> PAGEREF _Toc243780892 \h </w:instrText>
+              <w:instrText xml:space="preserve"> PAGEREF _Toc243781021 \h </w:instrText>
             </w:r>
             <w:r>
               <w:rPr>
@@ -5732,7 +5732,7 @@
               <w14:ligatures w14:val="standardContextual"/>
             </w:rPr>
           </w:pPr>
-          <w:hyperlink w:anchor="_Toc243780893" w:history="1">
+          <w:hyperlink w:anchor="_Toc243781022" w:history="1">
             <w:r>
               <w:rPr>
                 <w:rStyle w:val="Hyperlink"/>
@@ -5759,7 +5759,7 @@
                 <w:noProof/>
                 <w:webHidden/>
               </w:rPr>
-              <w:instrText xml:space="preserve"> PAGEREF _Toc243780893 \h </w:instrText>
+              <w:instrText xml:space="preserve"> PAGEREF _Toc243781022 \h </w:instrText>
             </w:r>
             <w:r>
               <w:rPr>
@@ -5803,7 +5803,7 @@
               <w14:ligatures w14:val="standardContextual"/>
             </w:rPr>
           </w:pPr>
-          <w:hyperlink w:anchor="_Toc243780894" w:history="1">
+          <w:hyperlink w:anchor="_Toc243781023" w:history="1">
             <w:r>
               <w:rPr>
                 <w:rStyle w:val="Hyperlink"/>
@@ -5830,7 +5830,7 @@
                 <w:noProof/>
                 <w:webHidden/>
               </w:rPr>
-              <w:instrText xml:space="preserve"> PAGEREF _Toc243780894 \h </w:instrText>
+              <w:instrText xml:space="preserve"> PAGEREF _Toc243781023 \h </w:instrText>
             </w:r>
             <w:r>
               <w:rPr>
@@ -5874,7 +5874,7 @@
               <w14:ligatures w14:val="standardContextual"/>
             </w:rPr>
           </w:pPr>
-          <w:hyperlink w:anchor="_Toc243780895" w:history="1">
+          <w:hyperlink w:anchor="_Toc243781024" w:history="1">
             <w:r>
               <w:rPr>
                 <w:rStyle w:val="Hyperlink"/>
@@ -5901,7 +5901,7 @@
                 <w:noProof/>
                 <w:webHidden/>
               </w:rPr>
-              <w:instrText xml:space="preserve"> PAGEREF _Toc243780895 \h </w:instrText>
+              <w:instrText xml:space="preserve"> PAGEREF _Toc243781024 \h </w:instrText>
             </w:r>
             <w:r>
               <w:rPr>
@@ -5945,7 +5945,7 @@
               <w14:ligatures w14:val="standardContextual"/>
             </w:rPr>
           </w:pPr>
-          <w:hyperlink w:anchor="_Toc243780896" w:history="1">
+          <w:hyperlink w:anchor="_Toc243781025" w:history="1">
             <w:r>
               <w:rPr>
                 <w:rStyle w:val="Hyperlink"/>
@@ -5972,7 +5972,7 @@
                 <w:noProof/>
                 <w:webHidden/>
               </w:rPr>
-              <w:instrText xml:space="preserve"> PAGEREF _Toc243780896 \h </w:instrText>
+              <w:instrText xml:space="preserve"> PAGEREF _Toc243781025 \h </w:instrText>
             </w:r>
             <w:r>
               <w:rPr>
@@ -6016,7 +6016,7 @@
               <w14:ligatures w14:val="standardContextual"/>
             </w:rPr>
           </w:pPr>
-          <w:hyperlink w:anchor="_Toc243780897" w:history="1">
+          <w:hyperlink w:anchor="_Toc243781026" w:history="1">
             <w:r>
               <w:rPr>
                 <w:rStyle w:val="Hyperlink"/>
@@ -6043,7 +6043,7 @@
                 <w:noProof/>
                 <w:webHidden/>
               </w:rPr>
-              <w:instrText xml:space="preserve"> PAGEREF _Toc243780897 \h </w:instrText>
+              <w:instrText xml:space="preserve"> PAGEREF _Toc243781026 \h </w:instrText>
             </w:r>
             <w:r>
               <w:rPr>
@@ -6087,7 +6087,7 @@
               <w14:ligatures w14:val="standardContextual"/>
             </w:rPr>
           </w:pPr>
-          <w:hyperlink w:anchor="_Toc243780898" w:history="1">
+          <w:hyperlink w:anchor="_Toc243781027" w:history="1">
             <w:r>
               <w:rPr>
                 <w:rStyle w:val="Hyperlink"/>
@@ -6114,7 +6114,7 @@
                 <w:noProof/>
                 <w:webHidden/>
               </w:rPr>
-              <w:instrText xml:space="preserve"> PAGEREF _Toc243780898 \h </w:instrText>
+              <w:instrText xml:space="preserve"> PAGEREF _Toc243781027 \h </w:instrText>
             </w:r>
             <w:r>
               <w:rPr>
@@ -6158,7 +6158,7 @@
               <w14:ligatures w14:val="standardContextual"/>
             </w:rPr>
           </w:pPr>
-          <w:hyperlink w:anchor="_Toc243780899" w:history="1">
+          <w:hyperlink w:anchor="_Toc243781028" w:history="1">
             <w:r>
               <w:rPr>
                 <w:rStyle w:val="Hyperlink"/>
@@ -6185,7 +6185,7 @@
                 <w:noProof/>
                 <w:webHidden/>
               </w:rPr>
-              <w:instrText xml:space="preserve"> PAGEREF _Toc243780899 \h </w:instrText>
+              <w:instrText xml:space="preserve"> PAGEREF _Toc243781028 \h </w:instrText>
             </w:r>
             <w:r>
               <w:rPr>
@@ -6229,7 +6229,7 @@
               <w14:ligatures w14:val="standardContextual"/>
             </w:rPr>
           </w:pPr>
-          <w:hyperlink w:anchor="_Toc243780900" w:history="1">
+          <w:hyperlink w:anchor="_Toc243781029" w:history="1">
             <w:r>
               <w:rPr>
                 <w:rStyle w:val="Hyperlink"/>
@@ -6256,7 +6256,7 @@
                 <w:noProof/>
                 <w:webHidden/>
               </w:rPr>
-              <w:instrText xml:space="preserve"> PAGEREF _Toc243780900 \h </w:instrText>
+              <w:instrText xml:space="preserve"> PAGEREF _Toc243781029 \h </w:instrText>
             </w:r>
             <w:r>
               <w:rPr>
@@ -6304,7 +6304,7 @@
         <w:pStyle w:val="Heading1"/>
       </w:pPr>
       <w:bookmarkStart w:id="8" w:name="chapter-1.-introduction"/>
-      <w:bookmarkStart w:id="9" w:name="_Toc243780853"/>
+      <w:bookmarkStart w:id="9" w:name="_Toc243780982"/>
       <w:bookmarkEnd w:id="6"/>
       <w:r>
         <w:lastRenderedPageBreak/>
@@ -6317,7 +6317,7 @@
         <w:pStyle w:val="Heading2"/>
       </w:pPr>
       <w:bookmarkStart w:id="10" w:name="context-selling-access-to-apis"/>
-      <w:bookmarkStart w:id="11" w:name="_Toc243780854"/>
+      <w:bookmarkStart w:id="11" w:name="_Toc243780983"/>
       <w:r>
         <w:t>1.1 Context: selling access to APIs</w:t>
       </w:r>
@@ -6360,7 +6360,7 @@
         <w:pStyle w:val="Heading2"/>
       </w:pPr>
       <w:bookmarkStart w:id="12" w:name="problem"/>
-      <w:bookmarkStart w:id="13" w:name="_Toc243780855"/>
+      <w:bookmarkStart w:id="13" w:name="_Toc243780984"/>
       <w:bookmarkEnd w:id="10"/>
       <w:r>
         <w:t>1.2 Problem</w:t>
@@ -6468,7 +6468,7 @@
         <w:pStyle w:val="Heading2"/>
       </w:pPr>
       <w:bookmarkStart w:id="14" w:name="goals"/>
-      <w:bookmarkStart w:id="15" w:name="_Toc243780856"/>
+      <w:bookmarkStart w:id="15" w:name="_Toc243780985"/>
       <w:bookmarkEnd w:id="12"/>
       <w:r>
         <w:t>1.3 Goals</w:t>
@@ -6812,7 +6812,7 @@
         <w:pStyle w:val="Heading2"/>
       </w:pPr>
       <w:bookmarkStart w:id="16" w:name="approach"/>
-      <w:bookmarkStart w:id="17" w:name="_Toc243780857"/>
+      <w:bookmarkStart w:id="17" w:name="_Toc243780986"/>
       <w:bookmarkEnd w:id="14"/>
       <w:r>
         <w:t>1.4 Approach</w:t>
@@ -6889,7 +6889,7 @@
         <w:pStyle w:val="Heading2"/>
       </w:pPr>
       <w:bookmarkStart w:id="18" w:name="contributions"/>
-      <w:bookmarkStart w:id="19" w:name="_Toc243780858"/>
+      <w:bookmarkStart w:id="19" w:name="_Toc243780987"/>
       <w:bookmarkEnd w:id="16"/>
       <w:r>
         <w:t>1.5 Contributions</w:t>
@@ -6933,7 +6933,7 @@
         <w:t xml:space="preserve"> so that plan changes rewrite nothing, with request-id deduplication and three overage policies (hard, grace, capped billable overage). A Free customer is stopped at exactly 200 of 400 concurrent calls through </w:t>
       </w:r>
       <w:r>
-        <w:t>gRPC on a three-master cluster (measured in Week 2). A retried call is counted once, and request 2,001 of a plan of 2,000 a day gets three different answers under the three overage policies, tested through gRPC (Week 4).</w:t>
+        <w:t>gRPC on a three-master cluster, and quotas were exact in 20 of 20 adversarial runs on four instances (5.2). A retried call is counted once, and request 2,001 of a plan of 2,000 a day gets three different answers under the three overage policies, tested through gRPC (5.3).</w:t>
       </w:r>
     </w:p>
     <w:p>
@@ -6952,10 +6952,10 @@
         <w:t>A lease-based fast path with a derived and measured accuracy bound.</w:t>
       </w:r>
       <w:r>
-        <w:t xml:space="preserve"> Cache-line-aligned leases in a lock-free table with single-flight refills, chunk sizes capped at a fraction of the limit, and pipelined Redis refills. The bound N × C is derived in Chapter 3 and measured there: on four </w:t>
-      </w:r>
-      <w:r>
-        <w:t>instances at chunk caps of 1%, 5% and 10% the worst case stays below it, as a model of the protocol predicts to within 0.3 tokens (Week 6).</w:t>
+        <w:t xml:space="preserve"> Cache-line-aligned leases in a lock-free table with single-flight refills, chunk sizes capped at a fraction of the limit, </w:t>
+      </w:r>
+      <w:r>
+        <w:t>and pipelined Redis refills. The bound N × C is derived in Chapter 3 and measured there: on four instances at chunk caps of 1%, 5% and 10% the worst case stays below it, as a model of the protocol predicts to within 0.3 tokens (5.4).</w:t>
       </w:r>
     </w:p>
     <w:p>
@@ -6974,10 +6974,10 @@
         <w:t>An evaluation that tests each half of the claim separately.</w:t>
       </w:r>
       <w:r>
-        <w:t xml:space="preserve"> Exactness tests (concurrency, day rollover, plan changes, overage), then performance and robustness tests (strict against leased mode, scaling across instances, floods, key cardinality, Redis failures), with reproducible scripts and raw results. A first strict baseline exists (Week 2: a median of 25,301 </w:t>
-      </w:r>
-      <w:r>
-        <w:t>checks per second for one instance on one laptop at high concurrency, 10,024 at p99 10.5 ms); the full matrix of Week 7 is in Chapter 5 (5.6).</w:t>
+        <w:t xml:space="preserve"> Exactness tests (concurrency, day rollover, plan changes, overage), then performance and robustness tests (strict against leased mode, scaling across instances, floods, key cardinality, Redis failures), with </w:t>
+      </w:r>
+      <w:r>
+        <w:t>reproducible scripts and raw results. Every table of Chapter 5 is generated by a script from the raw results, and the estimate for 1,000,000 checks per second is derived from measured per-instance figures with every assumption written out (5.11).</w:t>
       </w:r>
     </w:p>
     <w:p>
@@ -6985,7 +6985,7 @@
         <w:pStyle w:val="Heading2"/>
       </w:pPr>
       <w:bookmarkStart w:id="20" w:name="structure-of-the-thesis"/>
-      <w:bookmarkStart w:id="21" w:name="_Toc243780859"/>
+      <w:bookmarkStart w:id="21" w:name="_Toc243780988"/>
       <w:bookmarkEnd w:id="18"/>
       <w:r>
         <w:t>1.6 Structure of the thesis</w:t>
@@ -6997,17 +6997,17 @@
         <w:pStyle w:val="FirstParagraph"/>
       </w:pPr>
       <w:r>
-        <w:t xml:space="preserve">Chapter 2 introduces the background: rate limiting algorithms, the Redis properties the design relies on (single-threaded atomic scripts, cluster hash slots, failover), gRPC and Protocol Buffers, and existing rate limiting systems compared in one table. Chapter 3 presents the design: </w:t>
-      </w:r>
-      <w:r>
-        <w:t xml:space="preserve">requirements, architecture, data model, quota and overage logic, the </w:t>
+        <w:t xml:space="preserve">Chapter 2 introduces the background: rate limiting algorithms, the Redis properties the design relies on (single-threaded atomic scripts, cluster hash slots, failover), gRPC and Protocol Buffers, </w:t>
+      </w:r>
+      <w:r>
+        <w:t xml:space="preserve">and existing rate limiting systems compared in one table. Chapter 3 presents the design: requirements, architecture, data model, quota and overage logic, the </w:t>
       </w:r>
       <w:r>
         <w:lastRenderedPageBreak/>
-        <w:t xml:space="preserve">lease protocol with the derivation of its accuracy bound, failure policies, and the capacity estimate for one million checks per second. Chapter 4 describes the implementation: the Lua scripts, the Redis client and its measured selection, the lease table, the gRPC server and the test approach. Chapter 5 evaluates the system against each goal with measured results and their limitations. Chapter 6 concludes with </w:t>
-      </w:r>
-      <w:r>
-        <w:t>the results against the goals, the limitations, and future work.</w:t>
+        <w:t xml:space="preserve">lease protocol with the derivation of its accuracy bound, failure policies, and the capacity estimate for one million checks per second. Chapter 4 describes the implementation: the Lua scripts, the Redis client and its measured selection, the lease table, the gRPC server and the test approach. Chapter 5 evaluates </w:t>
+      </w:r>
+      <w:r>
+        <w:t>the system against each goal with measured results and their limitations. Chapter 6 concludes with the results against the goals, the limitations, and future work.</w:t>
       </w:r>
     </w:p>
     <w:p>
@@ -7020,7 +7020,7 @@
         <w:pStyle w:val="Heading1"/>
       </w:pPr>
       <w:bookmarkStart w:id="22" w:name="chapter-2.-background-and-related-work"/>
-      <w:bookmarkStart w:id="23" w:name="_Toc243780860"/>
+      <w:bookmarkStart w:id="23" w:name="_Toc243780989"/>
       <w:bookmarkEnd w:id="8"/>
       <w:bookmarkEnd w:id="20"/>
       <w:r>
@@ -7034,7 +7034,10 @@
         <w:pStyle w:val="FirstParagraph"/>
       </w:pPr>
       <w:r>
-        <w:t>This chapter introduces what the design in Chapter 3 builds on: the algorithms used to limit request rates (2.1), the properties of Redis that make an exact distributed counter possible (2.2), the gRPC and Protocol Buffers stack that carries every check (2.3), and the existing systems that solve related problems (2.4). Section 2.5 states what those systems leave open.</w:t>
+        <w:t xml:space="preserve">This chapter introduces what the design in Chapter 3 builds on: the algorithms used to limit request rates (2.1), the properties of Redis that make an exact distributed counter possible (2.2), the gRPC and Protocol Buffers stack that carries every check (2.3), and the existing systems </w:t>
+      </w:r>
+      <w:r>
+        <w:t>that solve related problems (2.4). Section 2.5 states what those systems leave open.</w:t>
       </w:r>
     </w:p>
     <w:p>
@@ -7042,7 +7045,7 @@
         <w:pStyle w:val="Heading2"/>
       </w:pPr>
       <w:bookmarkStart w:id="24" w:name="rate-limiting-algorithms"/>
-      <w:bookmarkStart w:id="25" w:name="_Toc243780861"/>
+      <w:bookmarkStart w:id="25" w:name="_Toc243780990"/>
       <w:r>
         <w:t>2.1 Rate limiting algorithms</w:t>
       </w:r>
@@ -7070,10 +7073,10 @@
         <w:pStyle w:val="FirstParagraph"/>
       </w:pPr>
       <w:r>
-        <w:t xml:space="preserve">Time is cut into consecutive windows of length T aligned to a fixed origin (for example the Unix epoch), and each client has one counter per window. A request is admitted if the counter is below </w:t>
-      </w:r>
-      <w:r>
-        <w:t>L, and the counter is incremented. State is one integer per client, and the counter can simply expire with its window.</w:t>
+        <w:t xml:space="preserve">Time is cut into consecutive windows of length T aligned to a fixed origin (for example the Unix </w:t>
+      </w:r>
+      <w:r>
+        <w:t>epoch), and each client has one counter per window. A request is admitted if the counter is below L, and the counter is incremented. State is one integer per client, and the counter can simply expire with its window.</w:t>
       </w:r>
     </w:p>
     <w:p>
@@ -7090,10 +7093,7 @@
         <w:t>WindowEdgeBurstFixedAdmitsTwiceTheLimitSlidingDoesNot</w:t>
       </w:r>
       <w:r>
-        <w:t xml:space="preserve"> sends L = 10 requests 150 ms before a </w:t>
-      </w:r>
-      <w:r>
-        <w:t>one-second window boundary and 10 more 20 ms after it: the fixed window admits all 20 within about 170 ms, the sliding window (2.1.2) at most one of the second ten.</w:t>
+        <w:t xml:space="preserve"> sends L = 10 requests 150 ms before a one-second window boundary and 10 more 20 ms after it: the fixed window admits all 20 within about 170 ms, the sliding window (2.1.2) at most one of the second ten.</w:t>
       </w:r>
     </w:p>
     <w:p>
@@ -7111,7 +7111,10 @@
         <w:pStyle w:val="FirstParagraph"/>
       </w:pPr>
       <w:r>
-        <w:t>A sliding window log stores the timestamp of every admitted request and admits a new one if fewer than L timestamps fall within the last T. It is exact but needs memory proportional to L per client, which is prohibitive for large limits.</w:t>
+        <w:t xml:space="preserve">A sliding window log stores the timestamp of every admitted request and admits a new one if fewer than L timestamps fall within the last T. It is exact but needs memory proportional to L per </w:t>
+      </w:r>
+      <w:r>
+        <w:t>client, which is prohibitive for large limits.</w:t>
       </w:r>
     </w:p>
     <w:p>
@@ -7119,10 +7122,10 @@
         <w:pStyle w:val="BodyText"/>
       </w:pPr>
       <w:r>
-        <w:t xml:space="preserve">The sliding window counter approximates the log with two fixed-window counters, the current and the previous one. The number of requests in the last T is estimated as the current count plus the previous count weighted by the fraction of the previous window that still overlaps the sliding interval. Cloudflare describes this approximation for its rate limiting, noting that it assumes a constant rate during the previous window and “in practice it proved to be good enough” [8]. State is </w:t>
-      </w:r>
-      <w:r>
-        <w:t>two integers per client, and the 2L edge burst of the fixed window disappears, at the price of a small error when traffic within the previous window was uneven.</w:t>
+        <w:t>The sliding window counter approximates the log with two fixed-window counters, the current and the previous one. The number of requests in the last T is estimated as the current count plus the previous count weighted by the fraction of the previous window that still overlaps the sliding interval. Cloudflare describes this approximation for its rate limiting, noting that it assumes a constant rate during the previous window and “</w:t>
+      </w:r>
+      <w:r>
+        <w:t>in practice it proved to be good enough” [8]. State is two integers per client, and the 2L edge burst of the fixed window disappears, at the price of a small error when traffic within the previous window was uneven.</w:t>
       </w:r>
     </w:p>
     <w:p>
@@ -7140,14 +7143,14 @@
         <w:pStyle w:val="FirstParagraph"/>
       </w:pPr>
       <w:r>
-        <w:t xml:space="preserve">A token bucket has a capacity b and a refill rate r. It starts full; each request of cost c takes c tokens if at least c are present and is denied otherwise; tokens are added continuously at rate r up to the capacity. Over any interval of length t the bucket admits at most b + r·t </w:t>
+        <w:t xml:space="preserve">A token bucket has a capacity b and a refill rate r. It starts full; each request of cost c takes c tokens if at least c are present and is denied otherwise; tokens are added continuously at rate r up </w:t>
+      </w:r>
+      <w:r>
+        <w:t xml:space="preserve">to the capacity. Over any interval of length t the bucket admits at most b + r·t </w:t>
       </w:r>
       <w:r>
         <w:lastRenderedPageBreak/>
-        <w:t xml:space="preserve">units, so it allows </w:t>
-      </w:r>
-      <w:r>
-        <w:t>a burst of size b after a quiet period and a sustained rate r otherwise. The same structure is used in network traffic conditioning, where RFC 2697 defines a marker based on token buckets with a committed and an excess burst size [19], and Amazon API Gateway describes its request throttling in terms of a token bucket with a rate and a burst [2].</w:t>
+        <w:t>units, so it allows a burst of size b after a quiet period and a sustained rate r otherwise. The same structure is used in network traffic conditioning, where RFC 2697 defines a marker based on token buckets with a committed and an excess burst size [19], and Amazon API Gateway describes its request throttling in terms of a token bucket with a rate and a burst [2].</w:t>
       </w:r>
     </w:p>
     <w:p>
@@ -7155,10 +7158,10 @@
         <w:pStyle w:val="BodyText"/>
       </w:pPr>
       <w:r>
-        <w:t xml:space="preserve">A token bucket needs only two numbers of state per client, the token count and the time of the last </w:t>
-      </w:r>
-      <w:r>
-        <w:t>refill: the tokens due since then can be computed when the next request arrives instead of by a timer. Two implementation details matter for a distributed limiter and recur in Chapter 3. First, “now” must come from one clock for every instance; otherwise two instances with skewed clocks compute different refills for the same bucket. Second, repeated fractional refills accumulate floating-point error unless the state is kept in integers, for example in thousandths of a token.</w:t>
+        <w:t xml:space="preserve">A token bucket needs only two numbers of state per client, the token count and the time of the last refill: the tokens due since then can be computed when the next request arrives instead of by a timer. Two implementation details matter for a distributed limiter and recur in Chapter 3. First, “now” must come from one clock for every instance; otherwise two instances with skewed clocks compute different refills for the same bucket. Second, repeated fractional refills accumulate </w:t>
+      </w:r>
+      <w:r>
+        <w:t>floating-point error unless the state is kept in integers, for example in thousandths of a token.</w:t>
       </w:r>
     </w:p>
     <w:p>
@@ -7184,10 +7187,7 @@
         <w:pStyle w:val="FirstParagraph"/>
       </w:pPr>
       <w:r>
-        <w:t xml:space="preserve">A daily quota is a fixed window whose length is one day and whose origin is midnight in an agreed time zone. It is the unit customers buy: “200 calls per day” </w:t>
-      </w:r>
-      <w:r>
-        <w:t>is easy to state in a price list, easy to show in a response header, and easy to reconcile with a bill. Its edge behaviour, the 2L burst of 2.1.1, is acceptable for a quota because what the customer pays for is the count per day, not the shape of traffic within it; the shape is the job of the second limit.</w:t>
+        <w:t>A daily quota is a fixed window whose length is one day and whose origin is midnight in an agreed time zone. It is the unit customers buy: “200 calls per day” is easy to state in a price list, easy to show in a response header, and easy to reconcile with a bill. Its edge behaviour, the 2L burst of 2.1.1, is acceptable for a quota because what the customer pays for is the count per day, not the shape of traffic within it; the shape is the job of the second limit.</w:t>
       </w:r>
     </w:p>
     <w:p>
@@ -7215,10 +7215,7 @@
         <w:t>quota</w:t>
       </w:r>
       <w:r>
-        <w:t xml:space="preserve"> answers “has this customer used what they paid for today?”</w:t>
-      </w:r>
-      <w:r>
-        <w:t xml:space="preserve">. It is small (hundreds or thousands per day for most customers), it is money, and it must be exact. The </w:t>
+        <w:t xml:space="preserve"> answers “has this customer used what they paid for today?”. It is small (hundreds or thousands per day for most customers), it is money, and it must be exact. The </w:t>
       </w:r>
       <w:r>
         <w:rPr>
@@ -7228,10 +7225,10 @@
         <w:t>burst limit</w:t>
       </w:r>
       <w:r>
-        <w:t xml:space="preserve"> answers “is this customer calling too fast right now?”. It protects the provider’s backend and other customers, it is checked on every call at the full request rate, and an error of a few tokens is harmless as long as it is bounded. A token bucket is the natural burst limit because it needs constant state, allows the short </w:t>
-      </w:r>
-      <w:r>
-        <w:t>bursts that real clients produce, and is cheap to evaluate. Using the two together lets the design spend exactness only where it is needed, which is the central decision of Chapter 3.</w:t>
+        <w:t xml:space="preserve"> answers “is this customer calling too fast right now?”. It protects the provider’s backend and other customers, it is checked </w:t>
+      </w:r>
+      <w:r>
+        <w:t>on every call at the full request rate, and an error of a few tokens is harmless as long as it is bounded. A token bucket is the natural burst limit because it needs constant state, allows the short bursts that real clients produce, and is cheap to evaluate. Using the two together lets the design spend exactness only where it is needed, which is the central decision of Chapter 3.</w:t>
       </w:r>
     </w:p>
     <w:p>
@@ -7239,7 +7236,7 @@
         <w:pStyle w:val="Heading2"/>
       </w:pPr>
       <w:bookmarkStart w:id="31" w:name="redis"/>
-      <w:bookmarkStart w:id="32" w:name="_Toc243780862"/>
+      <w:bookmarkStart w:id="32" w:name="_Toc243780991"/>
       <w:bookmarkEnd w:id="24"/>
       <w:bookmarkEnd w:id="30"/>
       <w:r>
@@ -7252,7 +7249,10 @@
         <w:pStyle w:val="FirstParagraph"/>
       </w:pPr>
       <w:r>
-        <w:t>Redis is an in-memory data store that keeps all data in RAM and serves it over a simple request/response protocol. Four of its properties carry the design: command execution on a single thread, atomic Lua scripts, a cluster mode that partitions keys by hash slot, and asynchronous replication.</w:t>
+        <w:t xml:space="preserve">Redis is an in-memory data store that keeps all data in RAM and serves it over a simple </w:t>
+      </w:r>
+      <w:r>
+        <w:t>request/response protocol. Four of its properties carry the design: command execution on a single thread, atomic Lua scripts, a cluster mode that partitions keys by hash slot, and asynchronous replication.</w:t>
       </w:r>
     </w:p>
     <w:p>
@@ -7270,7 +7270,10 @@
         <w:pStyle w:val="FirstParagraph"/>
       </w:pPr>
       <w:r>
-        <w:t>Redis executes commands one at a time on a single thread (later versions can use extra threads for socket I/O, but not for executing commands). Every command is therefore atomic with respect to every other. A check that has to read a counter, compare it with a limit and write it back is not a single command, though, and doing it as separate commands from a client would let two clients read the same value and both write an increment.</w:t>
+        <w:t xml:space="preserve">Redis executes commands one at a time on a single thread (later versions can use extra threads for socket I/O, but not for executing commands). Every command is therefore atomic with respect to every </w:t>
+      </w:r>
+      <w:r>
+        <w:t>other. A check that has to read a counter, compare it with a limit and write it back is not a single command, though, and doing it as separate commands from a client would let two clients read the same value and both write an increment.</w:t>
       </w:r>
     </w:p>
     <w:p>
@@ -7278,10 +7281,10 @@
         <w:pStyle w:val="BodyText"/>
       </w:pPr>
       <w:r>
-        <w:t xml:space="preserve">Lua scripts close that gap. A script runs inside the server, and “Redis guarantees the script’s atomic execution. While executing the script, all server activities are blocked during its entire runtime” [11]. A read-compare-write of a token bucket or a quota, written as one script, therefore behaves as one indivisible operation however many limiter instances call it. The same blocking is a constraint: a slow script blocks every client of that Redis node, so scripts must do constant work, </w:t>
-      </w:r>
-      <w:r>
-        <w:t>with no loops over data and no scans.</w:t>
+        <w:t xml:space="preserve">Lua scripts close that gap. A script runs inside the server, and “Redis guarantees the script’s atomic execution. While executing the script, all server activities are blocked during its entire runtime” </w:t>
+      </w:r>
+      <w:r>
+        <w:t>[11]. A read-compare-write of a token bucket or a quota, written as one script, therefore behaves as one indivisible operation however many limiter instances call it. The same blocking is a constraint: a slow script blocks every client of that Redis node, so scripts must do constant work, with no loops over data and no scans.</w:t>
       </w:r>
     </w:p>
     <w:p>
@@ -7289,7 +7292,10 @@
         <w:pStyle w:val="BodyText"/>
       </w:pPr>
       <w:r>
-        <w:t xml:space="preserve">Two rules of the scripting model shape the client code. First, the server keeps compiled scripts in a cache indexed by the SHA1 digest of their source, and a client invokes a cached script with </w:t>
+        <w:t xml:space="preserve">Two rules of the scripting model shape the client code. First, the server keeps compiled scripts in </w:t>
+      </w:r>
+      <w:r>
+        <w:t xml:space="preserve">a cache indexed by the SHA1 digest of their source, and a client invokes a cached script with </w:t>
       </w:r>
       <w:r>
         <w:rPr>
@@ -7334,10 +7340,7 @@
         <w:t>NOSCRIPT</w:t>
       </w:r>
       <w:r>
-        <w:t xml:space="preserve"> </w:t>
-      </w:r>
-      <w:r>
-        <w:t xml:space="preserve">error [11]. A client must therefore be prepared to fall back to </w:t>
+        <w:t xml:space="preserve"> error [11]. A client must therefore be prepared to fall back to </w:t>
       </w:r>
       <w:r>
         <w:rPr>
@@ -7346,7 +7349,10 @@
         <w:t>EVAL</w:t>
       </w:r>
       <w:r>
-        <w:t xml:space="preserve"> with the source, which runs the script and caches it again. Second, “all names of keys that a script accesses must be explicitly provided as input key arguments” [11]; a script that builds a key name internally works on a single server but breaks under cluster mode, because the cluster routes the call by its declared keys.</w:t>
+        <w:t xml:space="preserve"> with the source, which runs the script and caches it again. Second, “</w:t>
+      </w:r>
+      <w:r>
+        <w:t>all names of keys that a script accesses must be explicitly provided as input key arguments” [11]; a script that builds a key name internally works on a single server but breaks under cluster mode, because the cluster routes the call by its declared keys.</w:t>
       </w:r>
     </w:p>
     <w:p>
@@ -7361,10 +7367,7 @@
         <w:t>Time inside a script.</w:t>
       </w:r>
       <w:r>
-        <w:t xml:space="preserve"> A limiter needs “now” inside the script, both for token refills and for </w:t>
-      </w:r>
-      <w:r>
-        <w:t xml:space="preserve">the current day of a quota. Redis offers the </w:t>
+        <w:t xml:space="preserve"> A limiter needs “now” inside the script, both for token refills and for the current day of a quota. Redis offers the </w:t>
       </w:r>
       <w:r>
         <w:rPr>
@@ -7373,7 +7376,10 @@
         <w:t>TIME</w:t>
       </w:r>
       <w:r>
-        <w:t xml:space="preserve"> command, which returns the server’s clock. When scripts were replicated by re-running them on replicas, a non-deterministic command such as </w:t>
+        <w:t xml:space="preserve"> command, which returns the server’s clock. When </w:t>
+      </w:r>
+      <w:r>
+        <w:t xml:space="preserve">scripts were replicated by re-running them on replicas, a non-deterministic command such as </w:t>
       </w:r>
       <w:r>
         <w:rPr>
@@ -7391,10 +7397,7 @@
         <w:t>TIME</w:t>
       </w:r>
       <w:r>
-        <w:t xml:space="preserve"> freely [11]. Taking the time from the Redis node that </w:t>
-      </w:r>
-      <w:r>
-        <w:t>owns the key gives every limiter instance the same clock for that key.</w:t>
+        <w:t xml:space="preserve"> freely [11]. Taking the time from the Redis node that owns the key gives every limiter instance the same clock for that key.</w:t>
       </w:r>
     </w:p>
     <w:p>
@@ -7409,7 +7412,10 @@
         <w:t>Pipelining.</w:t>
       </w:r>
       <w:r>
-        <w:t xml:space="preserve"> A client may send several commands without waiting for each reply and read the replies afterwards in order. One network round trip then carries many commands, so throughput is no longer bounded by one round trip per call. The project’s client spike (</w:t>
+        <w:t xml:space="preserve"> </w:t>
+      </w:r>
+      <w:r>
+        <w:t>A client may send several commands without waiting for each reply and read the replies afterwards in order. One network round trip then carries many commands, so throughput is no longer bounded by one round trip per call. The project’s client spike (</w:t>
       </w:r>
       <w:r>
         <w:rPr>
@@ -7418,10 +7424,7 @@
         <w:t>docs/DESIGN.md</w:t>
       </w:r>
       <w:r>
-        <w:t xml:space="preserve">, section 3) measured about 290,000 script calls per second from one sending thread over one connection per </w:t>
-      </w:r>
-      <w:r>
-        <w:t>master, against a three-master cluster on one laptop, by keeping calls in flight instead of waiting for each.</w:t>
+        <w:t>, section 3) measured about 290,000 script calls per second from one sending thread over one connection per master, against a three-master cluster on one laptop, by keeping calls in flight instead of waiting for each.</w:t>
       </w:r>
     </w:p>
     <w:p>
@@ -7475,7 +7478,10 @@
         <w:pStyle w:val="BodyText"/>
       </w:pPr>
       <w:r>
-        <w:t xml:space="preserve">Commands that touch several keys, including a script with several keys, work only if all the keys are in the same slot. </w:t>
+        <w:t xml:space="preserve">Commands that touch several keys, including a script with several keys, work only if all the keys </w:t>
+      </w:r>
+      <w:r>
+        <w:t xml:space="preserve">are in the same slot. </w:t>
       </w:r>
       <w:r>
         <w:rPr>
@@ -7521,10 +7527,10 @@
         <w:t>cust:42</w:t>
       </w:r>
       <w:r>
-        <w:t xml:space="preserve">, so all of one customer’s state lives on one master and one script may read the plan and update the quota atomically. Distributing customers over masters </w:t>
-      </w:r>
-      <w:r>
-        <w:t>remains automatic, because different customers have different tags. The cost is that one very hot customer cannot be spread over several masters; Chapter 3 addresses that case with leases.</w:t>
+        <w:t xml:space="preserve">, so all of one customer’s state lives on one master and one script may read the plan and update the quota atomically. Distributing customers over masters remains automatic, because different customers have different tags. The cost is that one very hot </w:t>
+      </w:r>
+      <w:r>
+        <w:t>customer cannot be spread over several masters; Chapter 3 addresses that case with leases.</w:t>
       </w:r>
     </w:p>
     <w:p>
@@ -7542,10 +7548,10 @@
         <w:pStyle w:val="FirstParagraph"/>
       </w:pPr>
       <w:r>
-        <w:t>Each master can have replicas that receive its writes asynchronously. If a master fails, the cluster promotes one of its replicas after the node timeout. The specification is explicit about the consequence: asynchronous replication leaves “small windows where acknowledged writes can be lost”</w:t>
-      </w:r>
-      <w:r>
-        <w:t xml:space="preserve"> [12], because a master may acknowledge a write and fail before forwarding it. For a quota counter, this means a failover can lose a few increments, letting a customer make a few more calls than counted; Chapter 3 treats this as a limitation and points to the usage event log as the durable record for billing.</w:t>
+        <w:t xml:space="preserve">Each master can have replicas that receive its writes asynchronously. If a master fails, the cluster promotes one of its replicas after the node timeout. The specification is explicit about the consequence: asynchronous replication leaves “small windows where acknowledged writes can be lost” </w:t>
+      </w:r>
+      <w:r>
+        <w:t>[12], because a master may acknowledge a write and fail before forwarding it. For a quota counter, this means a failover can lose a few increments, letting a customer make a few more calls than counted; Chapter 3 treats this as a limitation and points to the usage event log as the durable record for billing.</w:t>
       </w:r>
     </w:p>
     <w:p>
@@ -7618,7 +7624,7 @@
         <w:pStyle w:val="Heading2"/>
       </w:pPr>
       <w:bookmarkStart w:id="36" w:name="grpc-and-protocol-buffers"/>
-      <w:bookmarkStart w:id="37" w:name="_Toc243780863"/>
+      <w:bookmarkStart w:id="37" w:name="_Toc243780992"/>
       <w:bookmarkEnd w:id="31"/>
       <w:bookmarkEnd w:id="35"/>
       <w:r>
@@ -7811,7 +7817,7 @@
         <w:pStyle w:val="Heading2"/>
       </w:pPr>
       <w:bookmarkStart w:id="38" w:name="related-systems"/>
-      <w:bookmarkStart w:id="39" w:name="_Toc243780864"/>
+      <w:bookmarkStart w:id="39" w:name="_Toc243780993"/>
       <w:bookmarkEnd w:id="36"/>
       <w:r>
         <w:t>2.4 Related systems</w:t>
@@ -8845,7 +8851,7 @@
         <w:pStyle w:val="Heading2"/>
       </w:pPr>
       <w:bookmarkStart w:id="40" w:name="summary"/>
-      <w:bookmarkStart w:id="41" w:name="_Toc243780865"/>
+      <w:bookmarkStart w:id="41" w:name="_Toc243780994"/>
       <w:bookmarkEnd w:id="38"/>
       <w:r>
         <w:lastRenderedPageBreak/>
@@ -8885,7 +8891,7 @@
         <w:pStyle w:val="Heading1"/>
       </w:pPr>
       <w:bookmarkStart w:id="42" w:name="chapter-3.-design"/>
-      <w:bookmarkStart w:id="43" w:name="_Toc243780866"/>
+      <w:bookmarkStart w:id="43" w:name="_Toc243780995"/>
       <w:bookmarkEnd w:id="22"/>
       <w:bookmarkEnd w:id="40"/>
       <w:r>
@@ -8899,7 +8905,7 @@
         <w:pStyle w:val="Heading2"/>
       </w:pPr>
       <w:bookmarkStart w:id="44" w:name="requirements"/>
-      <w:bookmarkStart w:id="45" w:name="_Toc243780867"/>
+      <w:bookmarkStart w:id="45" w:name="_Toc243780996"/>
       <w:r>
         <w:t>3.1 Requirements</w:t>
       </w:r>
@@ -10603,7 +10609,7 @@
         <w:t>REASON_UNVERIFIED</w:t>
       </w:r>
       <w:r>
-        <w:t xml:space="preserve">). Billing such calls would bill traffic that was never measured and might exceed the quota; the exactness promise of this thesis covers counted traffic only. Usage events (Week 4) mark these calls </w:t>
+        <w:t xml:space="preserve">). Billing such calls would bill traffic that was never measured and might exceed the quota; the exactness promise of this thesis covers counted traffic only. Usage events mark these calls </w:t>
       </w:r>
       <w:r>
         <w:rPr>
@@ -10661,7 +10667,7 @@
         <w:t xml:space="preserve"> A single rule is easy to state in a price list and to test: a Pay </w:t>
       </w:r>
       <w:r>
-        <w:t xml:space="preserve">customer with 2,000 calls per day may make 2,200 before being denied (the grace policy is built in Week 4). The amount is stored per plan in the </w:t>
+        <w:t xml:space="preserve">customer with 2,000 calls per day may make 2,200 before being denied. The amount is stored per plan in the </w:t>
       </w:r>
       <w:r>
         <w:rPr>
@@ -10678,7 +10684,7 @@
         <w:pStyle w:val="Heading2"/>
       </w:pPr>
       <w:bookmarkStart w:id="49" w:name="architecture"/>
-      <w:bookmarkStart w:id="50" w:name="_Toc243780868"/>
+      <w:bookmarkStart w:id="50" w:name="_Toc243780997"/>
       <w:bookmarkEnd w:id="44"/>
       <w:bookmarkEnd w:id="48"/>
       <w:r>
@@ -10715,7 +10721,7 @@
           <w:noProof/>
         </w:rPr>
         <w:drawing>
-          <wp:inline distT="0" distB="0" distL="0" distR="0" wp14:anchorId="2B32076C" wp14:editId="39538011">
+          <wp:inline distT="0" distB="0" distL="0" distR="0" wp14:anchorId="7BA24DF1" wp14:editId="1C9513FC">
             <wp:extent cx="5334000" cy="1765478"/>
             <wp:effectExtent l="0" t="0" r="0" b="0"/>
             <wp:docPr id="50" name="Picture" descr="Components of the service"/>
@@ -11647,7 +11653,7 @@
         <w:pStyle w:val="Heading2"/>
       </w:pPr>
       <w:bookmarkStart w:id="55" w:name="data-model"/>
-      <w:bookmarkStart w:id="56" w:name="_Toc243780869"/>
+      <w:bookmarkStart w:id="56" w:name="_Toc243780998"/>
       <w:bookmarkEnd w:id="49"/>
       <w:bookmarkEnd w:id="54"/>
       <w:r>
@@ -14059,7 +14065,7 @@
         <w:pStyle w:val="Heading2"/>
       </w:pPr>
       <w:bookmarkStart w:id="61" w:name="quota-and-overage-logic"/>
-      <w:bookmarkStart w:id="62" w:name="_Toc243780870"/>
+      <w:bookmarkStart w:id="62" w:name="_Toc243780999"/>
       <w:bookmarkEnd w:id="55"/>
       <w:bookmarkEnd w:id="60"/>
       <w:r>
@@ -14696,7 +14702,7 @@
         <w:t xml:space="preserve">, because the extra units are free: the reason field tells the </w:t>
       </w:r>
       <w:r>
-        <w:t>gateway what to bill, and only cap overage is billed. That choice is also what gives request 2,001 three different answers, which is the Week 4 gate. It is tested on the script alone and end to end through gRPC (</w:t>
+        <w:t>gateway what to bill, and only cap overage is billed. That choice is also what gives request 2,001 three different answers, one of the acceptance tests. It is tested on the script alone and end to end through gRPC (</w:t>
       </w:r>
       <w:r>
         <w:rPr>
@@ -14806,7 +14812,7 @@
         <w:pStyle w:val="BodyText"/>
       </w:pPr>
       <w:r>
-        <w:t xml:space="preserve">Plans themselves are cached on each instance for five seconds, which removed the plan read from every call: on the Week 2 strict benchmark the cache alone raised throughput from 16,738 to 19,480 checks per second (median of five runs each, same session). The admin tool writes a plan, then </w:t>
+        <w:t xml:space="preserve">Plans themselves are cached on each instance for five seconds, which removed the plan read from every call: on an early strict benchmark the cache alone raised throughput from 16,738 to 19,480 checks per second (median of five runs each, same session). The admin tool writes a plan, then </w:t>
       </w:r>
       <w:r>
         <w:t xml:space="preserve">publishes the customer id on a Pub/Sub channel, and every instance drops its cached plan and its local denial. A read in flight when the message arrives is discarded and sent again, because it may have read the old plan. An instance that loses its subscription drops every cached plan when it reconnects, because Pub/Sub keeps no messages for an absent subscriber. A plan change therefore applies within the delay of the message, measured at 22 ms from starting the admin tool until two </w:t>
@@ -14853,7 +14859,7 @@
         <w:t>limit</w:t>
       </w:r>
       <w:r>
-        <w:t xml:space="preserve"> units in a day. Units leased before midnight and used after it were counted for the old day, so N instances admit at most limit + N × C in one day: 0.4% of the day for four instances. Units leased and not used before the reset are an under-admission of at most N × C. In the gate test four instances shared one </w:t>
+        <w:t xml:space="preserve"> units in a day. Units leased before midnight and used after it were counted for the old day, so N instances admit at most limit + N × C in one day: 0.4% of the day for four instances. Units leased and not used before the reset are an under-admission of at most N × C. In the acceptance test four instances shared one </w:t>
       </w:r>
       <w:r>
         <w:t>customer of 100,000 a day (C = 100) with 20% more demand than the bound allows. They admitted exactly 100,000 units, with 1,253 quota calls for 12,048 checks instead of one per check. A leased call does not deduplicate request ids: a retry inside the plan counts again and uses up one more unit of the plan, though the retry itself is never billed as overage.</w:t>
@@ -14875,7 +14881,7 @@
         <w:pStyle w:val="Heading2"/>
       </w:pPr>
       <w:bookmarkStart w:id="68" w:name="lease-protocol-and-the-accuracy-bound"/>
-      <w:bookmarkStart w:id="69" w:name="_Toc243780871"/>
+      <w:bookmarkStart w:id="69" w:name="_Toc243781000"/>
       <w:bookmarkEnd w:id="61"/>
       <w:bookmarkEnd w:id="67"/>
       <w:r>
@@ -14898,7 +14904,7 @@
         <w:pStyle w:val="FirstParagraph"/>
       </w:pPr>
       <w:r>
-        <w:t xml:space="preserve">A strict check costs one Redis round trip, and its throughput on one instance is bounded by how many round trips are in flight: the Week 2 baseline admits 10,024 checks per second at a p99 of 10.5 ms </w:t>
+        <w:t xml:space="preserve">A strict check costs one Redis round trip, and its throughput on one instance is bounded by how many round trips are in flight: an early baseline admits 10,024 checks per second at a p99 of 10.5 ms </w:t>
       </w:r>
       <w:r>
         <w:t xml:space="preserve">with 64 concurrent calls, and needs 1,024 concurrent calls to reach 25,301. The burst limit is checked on every API call, almost always for customers far below their limit, so most of those round trips only confirm that tokens remain. A lease removes them: each limiter instance takes a share of a customer’s token bucket from Redis in advance and admits checks against it in its own memory, asking Redis again only when the share runs low. The cost is accuracy: tokens one instance holds are </w:t>
@@ -15336,7 +15342,7 @@
           <w:noProof/>
         </w:rPr>
         <w:drawing>
-          <wp:inline distT="0" distB="0" distL="0" distR="0" wp14:anchorId="5364F11A" wp14:editId="628265FC">
+          <wp:inline distT="0" distB="0" distL="0" distR="0" wp14:anchorId="1E2C60B9" wp14:editId="27875933">
             <wp:extent cx="5334000" cy="2252133"/>
             <wp:effectExtent l="0" t="0" r="0" b="0"/>
             <wp:docPr id="72" name="Picture" descr="Over-admission against the chunk cap"/>
@@ -15545,7 +15551,7 @@
         <w:pStyle w:val="Heading2"/>
       </w:pPr>
       <w:bookmarkStart w:id="75" w:name="deny-cache-and-idempotency"/>
-      <w:bookmarkStart w:id="76" w:name="_Toc243780872"/>
+      <w:bookmarkStart w:id="76" w:name="_Toc243781001"/>
       <w:bookmarkEnd w:id="68"/>
       <w:bookmarkEnd w:id="74"/>
       <w:r>
@@ -15882,7 +15888,7 @@
         <w:pStyle w:val="Heading2"/>
       </w:pPr>
       <w:bookmarkStart w:id="79" w:name="failure-policies-and-failure-modes"/>
-      <w:bookmarkStart w:id="80" w:name="_Toc243780873"/>
+      <w:bookmarkStart w:id="80" w:name="_Toc243781002"/>
       <w:bookmarkEnd w:id="75"/>
       <w:bookmarkEnd w:id="78"/>
       <w:r>
@@ -15961,7 +15967,7 @@
         <w:pStyle w:val="BodyText"/>
       </w:pPr>
       <w:r>
-        <w:t xml:space="preserve">The timeout is a deadline on each attempt, which the client library alone did not provide. Its timeout is an idle timeout per connection, re-armed by any reply that arrives. The fault test of Week 6 gave one master 80 ms of extra latency under load: its connection was never idle for 50 ms, no call timed out, and that master’s customers waited about 250 ms for three slow round trips instead of getting their plan’s policy. The resilient layer now answers every attempt as timed out </w:t>
+        <w:t xml:space="preserve">The timeout is a deadline on each attempt, which the client library alone did not provide. Its timeout is an idle timeout per connection, re-armed by any reply that arrives. The fault test (5.7) gave one master 80 ms of extra latency under load: its connection was never idle for 50 ms, no call timed out, and that master’s customers waited about 250 ms for three slow round trips instead of getting their plan’s policy. The resilient layer now answers every attempt as timed out </w:t>
       </w:r>
       <w:r>
         <w:t>at its deadline, whichever comes first of the reply and the deadline, and drops the late reply. The deadlines wait in a lock-free queue in send order (Vyukov’s multi-producer, single-consumer queue [26]), which a timer thread empties and checks in batches. In the whole server its cost is within run-to-run noise, and no deadline was missed at saturation or under open-loop overload at 30,000 checks per second (</w:t>
@@ -17068,7 +17074,7 @@
         <w:pStyle w:val="Heading2"/>
       </w:pPr>
       <w:bookmarkStart w:id="85" w:name="capacity-math"/>
-      <w:bookmarkStart w:id="86" w:name="_Toc243780874"/>
+      <w:bookmarkStart w:id="86" w:name="_Toc243781003"/>
       <w:bookmarkEnd w:id="79"/>
       <w:bookmarkEnd w:id="84"/>
       <w:r>
@@ -17094,7 +17100,7 @@
         <w:t xml:space="preserve"> </w:t>
       </w:r>
       <w:r>
-        <w:t>The final version, with the scaling measurements of Week 7, is in Chapter 5 (5.11).</w:t>
+        <w:t>The final version, with the scaling measurements, is in Chapter 5 (5.11).</w:t>
       </w:r>
     </w:p>
     <w:p>
@@ -17125,9 +17131,9 @@
         <w:tblLook w:val="0020" w:firstRow="1" w:lastRow="0" w:firstColumn="0" w:lastColumn="0" w:noHBand="0" w:noVBand="0"/>
       </w:tblPr>
       <w:tblGrid>
-        <w:gridCol w:w="2553"/>
-        <w:gridCol w:w="2192"/>
-        <w:gridCol w:w="4831"/>
+        <w:gridCol w:w="2513"/>
+        <w:gridCol w:w="2154"/>
+        <w:gridCol w:w="4909"/>
       </w:tblGrid>
       <w:tr>
         <w:trPr>
@@ -17206,7 +17212,7 @@
               <w:pStyle w:val="Compact"/>
             </w:pPr>
             <w:r>
-              <w:t>89,743 checks/s, p99 4.28 ms (75,652 before the Week 6 tuning)</w:t>
+              <w:t>89,743 checks/s, p99 4.28 ms (75,652 before the tuning of 5.10)</w:t>
             </w:r>
           </w:p>
         </w:tc>
@@ -17455,7 +17461,7 @@
               <w:t>docs/DESIGN.md</w:t>
             </w:r>
             <w:r>
-              <w:t xml:space="preserve"> section 3 (Week 1: 360,000/s on three masters, each at about one core)</w:t>
+              <w:t xml:space="preserve"> section 3 (an early spike: 360,000/s on three masters, each at about one core)</w:t>
             </w:r>
           </w:p>
         </w:tc>
@@ -18304,7 +18310,7 @@
         <w:t>Instances scale linearly.</w:t>
       </w:r>
       <w:r>
-        <w:t xml:space="preserve"> They share nothing but Redis, which makes it plausible. Four instances on the laptop reached 116,515 checks per second, which only shows that the laptop ran out of cores, not how instances scale. The Week 7 matrix confirms it: one to four instances on the same laptop share its CPUs and add no capacity, and none of the engines degrades with more instances (5.6).</w:t>
+        <w:t xml:space="preserve"> They share nothing but Redis, which makes it plausible. Four instances on the laptop reached 116,515 checks per second, which only shows that the laptop ran out of cores, not how instances scale. The benchmark matrix confirms it: one to four instances on the same laptop share its CPUs and add no capacity, and none of the engines degrades with more instances (5.6).</w:t>
       </w:r>
     </w:p>
     <w:p>
@@ -18377,7 +18383,7 @@
         <w:pStyle w:val="Heading1"/>
       </w:pPr>
       <w:bookmarkStart w:id="91" w:name="chapter-4.-implementation"/>
-      <w:bookmarkStart w:id="92" w:name="_Toc243780875"/>
+      <w:bookmarkStart w:id="92" w:name="_Toc243781004"/>
       <w:bookmarkEnd w:id="42"/>
       <w:bookmarkEnd w:id="85"/>
       <w:bookmarkEnd w:id="90"/>
@@ -18418,7 +18424,7 @@
         <w:pStyle w:val="Heading2"/>
       </w:pPr>
       <w:bookmarkStart w:id="93" w:name="project-structure-and-build"/>
-      <w:bookmarkStart w:id="94" w:name="_Toc243780876"/>
+      <w:bookmarkStart w:id="94" w:name="_Toc243781005"/>
       <w:r>
         <w:t>4.1 Project structure and build</w:t>
       </w:r>
@@ -19286,7 +19292,7 @@
         <w:pStyle w:val="Heading2"/>
       </w:pPr>
       <w:bookmarkStart w:id="95" w:name="lua-scripts"/>
-      <w:bookmarkStart w:id="96" w:name="_Toc243780877"/>
+      <w:bookmarkStart w:id="96" w:name="_Toc243781006"/>
       <w:bookmarkEnd w:id="93"/>
       <w:r>
         <w:t>4.2 Lua scripts</w:t>
@@ -21276,7 +21282,7 @@
         <w:pStyle w:val="Heading2"/>
       </w:pPr>
       <w:bookmarkStart w:id="97" w:name="redis-client-and-batching"/>
-      <w:bookmarkStart w:id="98" w:name="_Toc243780878"/>
+      <w:bookmarkStart w:id="98" w:name="_Toc243781007"/>
       <w:bookmarkEnd w:id="95"/>
       <w:r>
         <w:t>4.3 Redis client and batching</w:t>
@@ -21304,7 +21310,7 @@
         <w:t>AsyncRedisCluster</w:t>
       </w:r>
       <w:r>
-        <w:t>. A Week 1 spike reached 290,000 script calls a second from one thread on one connection per master, and about 360,000 on three masters, where each master used about one core (</w:t>
+        <w:t>. An early spike reached 290,000 script calls a second from one thread on one connection per master, and about 360,000 on three masters, where each master used about one core (</w:t>
       </w:r>
       <w:r>
         <w:rPr>
@@ -21633,7 +21639,7 @@
         <w:pStyle w:val="Heading2"/>
       </w:pPr>
       <w:bookmarkStart w:id="99" w:name="the-lease-table"/>
-      <w:bookmarkStart w:id="100" w:name="_Toc243780879"/>
+      <w:bookmarkStart w:id="100" w:name="_Toc243781008"/>
       <w:bookmarkEnd w:id="97"/>
       <w:r>
         <w:t>4.4 The lease table</w:t>
@@ -22271,7 +22277,7 @@
         <w:pStyle w:val="FirstParagraph"/>
       </w:pPr>
       <w:r>
-        <w:t>The table is open addressing over a fixed array of atomic pointers. A slot goes from empty to a lease exactly once, by compare-and-swap, and is never cleared or moved, so a lease pointer stays valid for the table’s life and lookups take no lock. A lookup compares the 64-bit id first and reads the key string only on a match. The price is that leases are never evicted, a recorded shortcut: one instance used 224 MB for about 650,000 leases over 1,000,000 keys (</w:t>
+        <w:t>The table is open addressing over a fixed array of atomic pointers. A slot goes from empty to a lease exactly once, by compare-and-swap, and is never cleared or moved, so a lease pointer stays valid for the table’s life and lookups take no lock. A lookup compares the 64-bit id first and reads the key string only on a match. The price is that leases are never evicted, a known limitation (6.2): one instance used 224 MB for about 650,000 leases over 1,000,000 keys (</w:t>
       </w:r>
       <w:r>
         <w:rPr>
@@ -22893,7 +22899,7 @@
         <w:pStyle w:val="Heading2"/>
       </w:pPr>
       <w:bookmarkStart w:id="101" w:name="the-grpc-server"/>
-      <w:bookmarkStart w:id="102" w:name="_Toc243780880"/>
+      <w:bookmarkStart w:id="102" w:name="_Toc243781009"/>
       <w:bookmarkEnd w:id="99"/>
       <w:r>
         <w:t>4.5 The gRPC server</w:t>
@@ -23261,7 +23267,7 @@
         <w:pStyle w:val="Heading2"/>
       </w:pPr>
       <w:bookmarkStart w:id="103" w:name="reliability"/>
-      <w:bookmarkStart w:id="104" w:name="_Toc243780881"/>
+      <w:bookmarkStart w:id="104" w:name="_Toc243781010"/>
       <w:bookmarkEnd w:id="101"/>
       <w:r>
         <w:t>4.6 Reliability</w:t>
@@ -23316,7 +23322,7 @@
         <w:t>Deadlines.</w:t>
       </w:r>
       <w:r>
-        <w:t xml:space="preserve"> Each attempt is answered as timed out after 50 ms unless Redis answered first. The client library’s own timeout is an idle timeout per connection, re-armed by any reply, so it did not bound a call: the fault test of Week 6 found a slow master never timed out (3.7.2). Every Redis call </w:t>
+        <w:t xml:space="preserve"> Each attempt is answered as timed out after 50 ms unless Redis answered first. The client library’s own timeout is an idle timeout per connection, re-armed by any reply, so it did not bound a call: the fault test (5.7) found a slow master never timed out (3.7.2). Every Redis call </w:t>
       </w:r>
       <w:r>
         <w:t>registers a deadline, so the structure that holds them is on a busy path, and a first version guarded by a mutex cost 448 ns a call and serialised the threads. The final version is Vyukov’s intrusive multi-producer, single-consumer queue [26].</w:t>
@@ -23866,7 +23872,7 @@
         <w:pStyle w:val="Heading2"/>
       </w:pPr>
       <w:bookmarkStart w:id="105" w:name="testing"/>
-      <w:bookmarkStart w:id="106" w:name="_Toc243780882"/>
+      <w:bookmarkStart w:id="106" w:name="_Toc243781011"/>
       <w:bookmarkEnd w:id="103"/>
       <w:r>
         <w:t>4.7 Testing</w:t>
@@ -24472,7 +24478,7 @@
         <w:pStyle w:val="Heading1"/>
       </w:pPr>
       <w:bookmarkStart w:id="107" w:name="chapter-5.-evaluation"/>
-      <w:bookmarkStart w:id="108" w:name="_Toc243780883"/>
+      <w:bookmarkStart w:id="108" w:name="_Toc243781012"/>
       <w:bookmarkEnd w:id="91"/>
       <w:bookmarkEnd w:id="105"/>
       <w:r>
@@ -24506,7 +24512,7 @@
         <w:pStyle w:val="Heading2"/>
       </w:pPr>
       <w:bookmarkStart w:id="109" w:name="setup"/>
-      <w:bookmarkStart w:id="110" w:name="_Toc243780884"/>
+      <w:bookmarkStart w:id="110" w:name="_Toc243781013"/>
       <w:r>
         <w:t>5.1 Setup</w:t>
       </w:r>
@@ -24832,7 +24838,7 @@
         <w:pStyle w:val="Heading2"/>
       </w:pPr>
       <w:bookmarkStart w:id="111" w:name="quota-accuracy-evaluation-test-1"/>
-      <w:bookmarkStart w:id="112" w:name="_Toc243780885"/>
+      <w:bookmarkStart w:id="112" w:name="_Toc243781014"/>
       <w:bookmarkEnd w:id="109"/>
       <w:r>
         <w:t>5.2 Quota accuracy (evaluation test 1)</w:t>
@@ -25071,7 +25077,7 @@
         <w:pStyle w:val="Heading2"/>
       </w:pPr>
       <w:bookmarkStart w:id="113" w:name="X10dcf500e19beaa52c34804ba99748b5447979c"/>
-      <w:bookmarkStart w:id="114" w:name="_Toc243780886"/>
+      <w:bookmarkStart w:id="114" w:name="_Toc243781015"/>
       <w:bookmarkEnd w:id="111"/>
       <w:r>
         <w:t>5.3 Plan changes, the reset and overage (evaluation tests 2 and 3)</w:t>
@@ -25334,7 +25340,7 @@
         <w:pStyle w:val="Heading2"/>
       </w:pPr>
       <w:bookmarkStart w:id="115" w:name="X4ce994a426e51be3f5a8a3472c2e7886379ef3b"/>
-      <w:bookmarkStart w:id="116" w:name="_Toc243780887"/>
+      <w:bookmarkStart w:id="116" w:name="_Toc243781016"/>
       <w:bookmarkEnd w:id="113"/>
       <w:r>
         <w:t>5.4 The burst accuracy bound and its model (evaluation tests 4 and 12)</w:t>
@@ -25493,7 +25499,7 @@
           <w:noProof/>
         </w:rPr>
         <w:drawing>
-          <wp:inline distT="0" distB="0" distL="0" distR="0" wp14:anchorId="3F8F51D5" wp14:editId="784337AF">
+          <wp:inline distT="0" distB="0" distL="0" distR="0" wp14:anchorId="0E75B1A7" wp14:editId="542D0904">
             <wp:extent cx="5334000" cy="2252133"/>
             <wp:effectExtent l="0" t="0" r="0" b="0"/>
             <wp:docPr id="102" name="Picture" descr="Over-admission against the chunk cap"/>
@@ -25932,7 +25938,7 @@
         <w:pStyle w:val="Heading2"/>
       </w:pPr>
       <w:bookmarkStart w:id="117" w:name="X58cba1dc9dd2145f6cc788b95e278fbb8eb6a7b"/>
-      <w:bookmarkStart w:id="118" w:name="_Toc243780888"/>
+      <w:bookmarkStart w:id="118" w:name="_Toc243781017"/>
       <w:bookmarkEnd w:id="115"/>
       <w:r>
         <w:t>5.5 Floods and many customers (evaluation tests 5 and 6)</w:t>
@@ -26148,7 +26154,7 @@
         <w:pStyle w:val="Heading2"/>
       </w:pPr>
       <w:bookmarkStart w:id="119" w:name="X3f8420a7fa9505dee7ed094c33348829e2973b7"/>
-      <w:bookmarkStart w:id="120" w:name="_Toc243780889"/>
+      <w:bookmarkStart w:id="120" w:name="_Toc243781018"/>
       <w:bookmarkEnd w:id="117"/>
       <w:r>
         <w:t>5.6 Strict against leased, and scaling (evaluation tests 7 and 8)</w:t>
@@ -27144,7 +27150,7 @@
         <w:pStyle w:val="BodyText"/>
       </w:pPr>
       <w:r>
-        <w:t xml:space="preserve">At the Week 5 gate a leased check queued beyond 20,000 offered (p99 156 ms at 30,000). The knee is now </w:t>
+        <w:t xml:space="preserve">On an earlier build (2026-10-21) a leased check queued beyond 20,000 offered (p99 156 ms at 30,000). The knee is now </w:t>
       </w:r>
       <w:r>
         <w:t>beyond 40,000, consistent with the throughput gained since (5.10). A leased check stays under 1 ms at p99 at 10,000 a second, against the 2 ms target of Chapter 3.</w:t>
@@ -27345,7 +27351,7 @@
           <w:noProof/>
         </w:rPr>
         <w:drawing>
-          <wp:inline distT="0" distB="0" distL="0" distR="0" wp14:anchorId="45BC3693" wp14:editId="608684EF">
+          <wp:inline distT="0" distB="0" distL="0" distR="0" wp14:anchorId="5EBFC4E1" wp14:editId="7DF0D130">
             <wp:extent cx="5334000" cy="2987040"/>
             <wp:effectExtent l="0" t="0" r="0" b="0"/>
             <wp:docPr id="107" name="Picture" descr="Throughput against concurrency, with USL fits"/>
@@ -27485,7 +27491,7 @@
         <w:pStyle w:val="Heading2"/>
       </w:pPr>
       <w:bookmarkStart w:id="121" w:name="faults-evaluation-test-9"/>
-      <w:bookmarkStart w:id="122" w:name="_Toc243780890"/>
+      <w:bookmarkStart w:id="122" w:name="_Toc243781019"/>
       <w:bookmarkEnd w:id="119"/>
       <w:r>
         <w:t>5.7 Faults (evaluation test 9)</w:t>
@@ -27835,7 +27841,7 @@
         <w:pStyle w:val="Heading2"/>
       </w:pPr>
       <w:bookmarkStart w:id="123" w:name="a-noisy-neighbour-evaluation-test-11"/>
-      <w:bookmarkStart w:id="124" w:name="_Toc243780891"/>
+      <w:bookmarkStart w:id="124" w:name="_Toc243781020"/>
       <w:bookmarkEnd w:id="121"/>
       <w:r>
         <w:t>5.8 A noisy neighbour (evaluation test 11)</w:t>
@@ -28103,7 +28109,7 @@
         <w:pStyle w:val="Heading2"/>
       </w:pPr>
       <w:bookmarkStart w:id="125" w:name="ablation-evaluation-test-10"/>
-      <w:bookmarkStart w:id="126" w:name="_Toc243780892"/>
+      <w:bookmarkStart w:id="126" w:name="_Toc243781021"/>
       <w:bookmarkEnd w:id="123"/>
       <w:r>
         <w:t>5.9 Ablation (evaluation test 10)</w:t>
@@ -28884,7 +28890,7 @@
         <w:t>The batcher</w:t>
       </w:r>
       <w:r>
-        <w:t xml:space="preserve"> gained nothing in Week 3 either, and stays off.</w:t>
+        <w:t xml:space="preserve"> gained nothing in an earlier comparison either (4.3), and stays off.</w:t>
       </w:r>
     </w:p>
     <w:p>
@@ -28907,7 +28913,7 @@
         <w:pStyle w:val="Heading2"/>
       </w:pPr>
       <w:bookmarkStart w:id="127" w:name="profiling-and-speed-ups"/>
-      <w:bookmarkStart w:id="128" w:name="_Toc243780893"/>
+      <w:bookmarkStart w:id="128" w:name="_Toc243781022"/>
       <w:bookmarkEnd w:id="125"/>
       <w:r>
         <w:t>5.10 Profiling and speed-ups</w:t>
@@ -28926,7 +28932,10 @@
         <w:t>The final build’s profile</w:t>
       </w:r>
       <w:r>
-        <w:t xml:space="preserve"> (</w:t>
+        <w:t xml:space="preserve"> </w:t>
+      </w:r>
+      <w:r>
+        <w:t>(</w:t>
       </w:r>
       <w:r>
         <w:rPr>
@@ -29198,7 +29207,7 @@
           <w:noProof/>
         </w:rPr>
         <w:drawing>
-          <wp:inline distT="0" distB="0" distL="0" distR="0" wp14:anchorId="23A6B55E" wp14:editId="4D88AA3E">
+          <wp:inline distT="0" distB="0" distL="0" distR="0" wp14:anchorId="1A961C65" wp14:editId="0BCC0F35">
             <wp:extent cx="5334000" cy="2511425"/>
             <wp:effectExtent l="0" t="0" r="0" b="0"/>
             <wp:docPr id="114" name="Picture" descr="Flamegraph of the leased rule under load"/>
@@ -29249,14 +29258,7 @@
           <w:i/>
           <w:iCs/>
         </w:rPr>
-        <w:t xml:space="preserve">Figure 5.3: Where a leased check’s CPU goes. Each bar is a function, its width the share of samples; </w:t>
-      </w:r>
-      <w:r>
-        <w:rPr>
-          <w:i/>
-          <w:iCs/>
-        </w:rPr>
-        <w:t xml:space="preserve">stacks are cut at 40 frames, which changes no width (0.33% of samples are deeper). The interactive versions are </w:t>
+        <w:t xml:space="preserve">Figure 5.3: Where a leased check’s CPU goes. Each bar is a function, its width the share of samples; stacks are cut at 40 frames, which changes no width (0.33% of samples are deeper). The interactive versions are </w:t>
       </w:r>
       <w:r>
         <w:rPr>
@@ -29698,7 +29700,7 @@
         <w:pStyle w:val="Heading2"/>
       </w:pPr>
       <w:bookmarkStart w:id="129" w:name="Xcb6f6a659d9871103a44718ddb5c28254b2134c"/>
-      <w:bookmarkStart w:id="130" w:name="_Toc243780894"/>
+      <w:bookmarkStart w:id="130" w:name="_Toc243781023"/>
       <w:bookmarkEnd w:id="127"/>
       <w:r>
         <w:t>5.11 Extrapolation to 1,000,000 checks per second</w:t>
@@ -29741,14 +29743,7 @@
           <w:i/>
           <w:iCs/>
         </w:rPr>
-        <w:t xml:space="preserve">Table 5.11: Redis masters at 1,000,000 checks per second, for traffic of one kind of check only; a </w:t>
-      </w:r>
-      <w:r>
-        <w:rPr>
-          <w:i/>
-          <w:iCs/>
-        </w:rPr>
-        <w:t>real mix lies between the rows. A master is taken to absorb 120,000 script calls a second.</w:t>
+        <w:t>Table 5.11: Redis masters at 1,000,000 checks per second, for traffic of one kind of check only; a real mix lies between the rows. A master is taken to absorb 120,000 script calls a second.</w:t>
       </w:r>
     </w:p>
     <w:tbl>
@@ -30415,10 +30410,7 @@
         <w:t>Redis:</w:t>
       </w:r>
       <w:r>
-        <w:t xml:space="preserve"> </w:t>
-      </w:r>
-      <w:r>
-        <w:t>one or two masters, even when a million keys are active.</w:t>
+        <w:t xml:space="preserve"> one or two masters, even when a million keys are active.</w:t>
       </w:r>
     </w:p>
     <w:p>
@@ -30929,7 +30921,7 @@
         <w:t>Assumptions</w:t>
       </w:r>
       <w:r>
-        <w:t xml:space="preserve"> (3.8.4), with what Week 7 added:</w:t>
+        <w:t xml:space="preserve"> (3.8.4), with what the measurements added:</w:t>
       </w:r>
     </w:p>
     <w:p>
@@ -31006,7 +30998,7 @@
         <w:pStyle w:val="Heading2"/>
       </w:pPr>
       <w:bookmarkStart w:id="131" w:name="discussion-and-threats-to-validity"/>
-      <w:bookmarkStart w:id="132" w:name="_Toc243780895"/>
+      <w:bookmarkStart w:id="132" w:name="_Toc243781024"/>
       <w:bookmarkEnd w:id="129"/>
       <w:r>
         <w:t>5.12 Discussion and threats to validity</w:t>
@@ -31244,7 +31236,7 @@
         <w:pStyle w:val="Heading1"/>
       </w:pPr>
       <w:bookmarkStart w:id="133" w:name="chapter-6.-conclusion"/>
-      <w:bookmarkStart w:id="134" w:name="_Toc243780896"/>
+      <w:bookmarkStart w:id="134" w:name="_Toc243781025"/>
       <w:bookmarkEnd w:id="107"/>
       <w:bookmarkEnd w:id="131"/>
       <w:r>
@@ -31348,7 +31340,7 @@
         <w:pStyle w:val="Heading2"/>
       </w:pPr>
       <w:bookmarkStart w:id="135" w:name="results-against-the-goals"/>
-      <w:bookmarkStart w:id="136" w:name="_Toc243780897"/>
+      <w:bookmarkStart w:id="136" w:name="_Toc243781026"/>
       <w:r>
         <w:t>6.1 Results against the goals</w:t>
       </w:r>
@@ -31864,7 +31856,7 @@
           <w:b/>
           <w:bCs/>
         </w:rPr>
-        <w:t>One Week 3 target was not met.</w:t>
+        <w:t>One intermediate target was not met.</w:t>
       </w:r>
       <w:r>
         <w:t xml:space="preserve"> A leased instance at four times the strict baseline would be 101,204 checks/s. On the laptop, gRPC with no limiter at all runs at 82,700 to 91,200, so no limiter can reach that on one instance with one check per call. With </w:t>
@@ -31934,7 +31926,7 @@
         <w:pStyle w:val="Heading2"/>
       </w:pPr>
       <w:bookmarkStart w:id="137" w:name="limitations"/>
-      <w:bookmarkStart w:id="138" w:name="_Toc243780898"/>
+      <w:bookmarkStart w:id="138" w:name="_Toc243781027"/>
       <w:bookmarkEnd w:id="135"/>
       <w:r>
         <w:t>6.2 Limitations</w:t>
@@ -32107,7 +32099,7 @@
         <w:pStyle w:val="Heading2"/>
       </w:pPr>
       <w:bookmarkStart w:id="139" w:name="future-work"/>
-      <w:bookmarkStart w:id="140" w:name="_Toc243780899"/>
+      <w:bookmarkStart w:id="140" w:name="_Toc243781028"/>
       <w:bookmarkEnd w:id="137"/>
       <w:r>
         <w:t>6.3 Future work</w:t>
@@ -32130,10 +32122,10 @@
         <w:t>Run the evaluation on separate machines</w:t>
       </w:r>
       <w:r>
-        <w:t xml:space="preserve"> (dropped from Week 8: the AWS run). This would turn the</w:t>
-      </w:r>
-      <w:r>
-        <w:t xml:space="preserve"> extrapolation of 5.11 into a measurement and test its assumptions, starting with linear scaling across instances and a master’s capacity for the quota script.</w:t>
+        <w:t xml:space="preserve"> </w:t>
+      </w:r>
+      <w:r>
+        <w:t>(planned as a cloud run and not done). This would turn the extrapolation of 5.11 into a measurement and test its assumptions, starting with linear scaling across instances and a master’s capacity for the quota script.</w:t>
       </w:r>
     </w:p>
     <w:p>
@@ -32171,7 +32163,10 @@
         <w:t>Route each customer to one instance</w:t>
       </w:r>
       <w:r>
-        <w:t xml:space="preserve"> (consistent hashing in the gateway). Plan reads would fall from N × A to A per cache lifetime, and the customer’s lease bound from N × C to C.</w:t>
+        <w:t xml:space="preserve"> (consistent hashing in the gateway). Plan reads would fall </w:t>
+      </w:r>
+      <w:r>
+        <w:t>from N × A to A per cache lifetime, and the customer’s lease bound from N × C to C.</w:t>
       </w:r>
     </w:p>
     <w:p>
@@ -32330,7 +32325,7 @@
         <w:pStyle w:val="Heading1"/>
       </w:pPr>
       <w:bookmarkStart w:id="141" w:name="references"/>
-      <w:bookmarkStart w:id="142" w:name="_Toc243780900"/>
+      <w:bookmarkStart w:id="142" w:name="_Toc243781029"/>
       <w:bookmarkEnd w:id="133"/>
       <w:bookmarkEnd w:id="139"/>
       <w:r>
@@ -32374,7 +32369,10 @@
         <w:t>B</w:t>
       </w:r>
       <w:r>
-        <w:t xml:space="preserve"> = bibliographic details checked online on 2026-10-25, cited for its standard result. Web pages: accessed 2026-10-17 unless noted.</w:t>
+        <w:t xml:space="preserve"> = bibliographic </w:t>
+      </w:r>
+      <w:r>
+        <w:t>details checked online on 2026-10-25, cited for its standard result. Web pages: accessed 2026-10-17 unless noted.</w:t>
       </w:r>
     </w:p>
     <w:p>
@@ -32422,10 +32420,10 @@
         <w:t>V</w:t>
       </w:r>
       <w:r>
-        <w:t xml:space="preserve"> Amazon Web Services. “Throttle requests to your REST APIs for better throughput in API Gateway.” </w:t>
-      </w:r>
-      <w:r>
-        <w:t>https://docs.aws.amazon.com/apigateway/latest/developerguide/api-gateway-request-throttling.html Token bucket throttling; throttles and quotas “should be thought of as targets rather than guaranteed request ceilings.”</w:t>
+        <w:t xml:space="preserve"> Amazon Web Services. “</w:t>
+      </w:r>
+      <w:r>
+        <w:t>Throttle requests to your REST APIs for better throughput in API Gateway.” https://docs.aws.amazon.com/apigateway/latest/developerguide/api-gateway-request-throttling.html Token bucket throttling; throttles and quotas “should be thought of as targets rather than guaranteed request ceilings.”</w:t>
       </w:r>
     </w:p>
     <w:p>
@@ -32508,7 +32506,10 @@
         <w:t>V</w:t>
       </w:r>
       <w:r>
-        <w:t xml:space="preserve"> Kong Inc. “Rate limiting strategies.” https://developer.konghq.com/gateway/rate-limiting/strategies/</w:t>
+        <w:t xml:space="preserve"> Kong Inc. “</w:t>
+      </w:r>
+      <w:r>
+        <w:t>Rate limiting strategies.” https://developer.konghq.com/gateway/rate-limiting/strategies/</w:t>
       </w:r>
     </w:p>
     <w:p>
@@ -32527,10 +32528,7 @@
         <w:t>V</w:t>
       </w:r>
       <w:r>
-        <w:t xml:space="preserve"> </w:t>
-      </w:r>
-      <w:r>
-        <w:t xml:space="preserve">Envoy Proxy project. </w:t>
+        <w:t xml:space="preserve"> Envoy Proxy project. </w:t>
       </w:r>
       <w:r>
         <w:rPr>
@@ -32577,10 +32575,10 @@
         <w:t>V</w:t>
       </w:r>
       <w:r>
-        <w:t xml:space="preserve"> Unkey. “Ratelimiting” documentation and engineering notes. https://unkey.com/docs/platform/ratelimiting/introduction , https://engineering.unkey.com/architecture/services/api/ratelimiting . Source: </w:t>
-      </w:r>
-      <w:r>
-        <w:t>https://github.com/unkeyed/unkey (AGPL-3.0). Sliding window; regional decisions with global convergence within seconds (vendor statement).</w:t>
+        <w:t xml:space="preserve"> Unkey. “Ratelimiting” documentation and engineering notes. https://unkey.com/docs/platform/ratelimiting/introduction , </w:t>
+      </w:r>
+      <w:r>
+        <w:t>https://engineering.unkey.com/architecture/services/api/ratelimiting . Source: https://github.com/unkeyed/unkey (AGPL-3.0). Sliding window; regional decisions with global convergence within seconds (vendor statement).</w:t>
       </w:r>
     </w:p>
     <w:p>
@@ -32628,10 +32626,10 @@
         <w:t>The Cloudflare Blog.</w:t>
       </w:r>
       <w:r>
-        <w:t xml:space="preserve"> https://blog.cloudflare.com/counting-things-a-lot-of-different-things/ </w:t>
-      </w:r>
-      <w:r>
-        <w:t>Sliding window approximation weighting the previous window; “in practice it proved to be good enough.”</w:t>
+        <w:t xml:space="preserve"> </w:t>
+      </w:r>
+      <w:r>
+        <w:t>https://blog.cloudflare.com/counting-things-a-lot-of-different-things/ Sliding window approximation weighting the previous window; “in practice it proved to be good enough.”</w:t>
       </w:r>
     </w:p>
     <w:p>
@@ -32673,10 +32671,10 @@
         <w:t>V</w:t>
       </w:r>
       <w:r>
-        <w:t xml:space="preserve"> C. G. Gray, D. R. Cheriton. “Leases: An Efficient Fault-Tolerant Mechanism for </w:t>
-      </w:r>
-      <w:r>
-        <w:t xml:space="preserve">Distributed File Cache Consistency.” </w:t>
+        <w:t xml:space="preserve"> </w:t>
+      </w:r>
+      <w:r>
+        <w:t xml:space="preserve">C. G. Gray, D. R. Cheriton. “Leases: An Efficient Fault-Tolerant Mechanism for Distributed File Cache Consistency.” </w:t>
       </w:r>
       <w:r>
         <w:rPr>
@@ -32696,10 +32694,10 @@
         <w:t>lease</w:t>
       </w:r>
       <w:r>
-        <w:t xml:space="preserve"> is a contract that gives its holder specified rights over property for a limited period of time.” The abstract: leases are “a time-based mechanism”; “</w:t>
-      </w:r>
-      <w:r>
-        <w:t>Non-Byzantine failures affect performance, not correctness, with their effect minimized by short leases.”</w:t>
+        <w:t xml:space="preserve"> is a contract that gives its holder specified rights over property for a limited period of time.” </w:t>
+      </w:r>
+      <w:r>
+        <w:t>The abstract: leases are “a time-based mechanism”; “Non-Byzantine failures affect performance, not correctness, with their effect minimized by short leases.”</w:t>
       </w:r>
     </w:p>
     <w:p>
@@ -32736,10 +32734,7 @@
         <w:t>TIME</w:t>
       </w:r>
       <w:r>
-        <w:t xml:space="preserve"> </w:t>
-      </w:r>
-      <w:r>
-        <w:t>before writes.</w:t>
+        <w:t xml:space="preserve"> before writes.</w:t>
       </w:r>
     </w:p>
     <w:p>
@@ -32786,7 +32781,10 @@
         <w:t>V</w:t>
       </w:r>
       <w:r>
-        <w:t xml:space="preserve"> gRPC Authors. “Retry.” https://grpc.io/docs/guides/retry/ Retries only for status codes in the policy’s retryable list, with exponential backoff.</w:t>
+        <w:t xml:space="preserve"> gRPC Authors. “Retry.” https://grpc.io/docs/guides/retry/ </w:t>
+      </w:r>
+      <w:r>
+        <w:t>Retries only for status codes in the policy’s retryable list, with exponential backoff.</w:t>
       </w:r>
     </w:p>
     <w:p>
@@ -32805,10 +32803,7 @@
         <w:t>V</w:t>
       </w:r>
       <w:r>
-        <w:t xml:space="preserve"> gRPC Authors. “Deadlines.” https://grpc.io/docs/guides/deadlines/ and “</w:t>
-      </w:r>
-      <w:r>
-        <w:t xml:space="preserve">Status Codes.” https://grpc.io/docs/guides/status-codes/ (accessed 2026-10-18). “By default, gRPC does not set a deadline”; past the deadline the call fails with </w:t>
+        <w:t xml:space="preserve"> gRPC Authors. “Deadlines.” https://grpc.io/docs/guides/deadlines/ and “Status Codes.” https://grpc.io/docs/guides/status-codes/ (accessed 2026-10-18). “By default, gRPC does not set a deadline”; past the deadline the call fails with </w:t>
       </w:r>
       <w:r>
         <w:rPr>
@@ -32844,7 +32839,10 @@
         <w:t>RESOURCE_EXHAUSTED</w:t>
       </w:r>
       <w:r>
-        <w:t xml:space="preserve"> (8): “Some resource has been exhausted, perhaps a per-user quota, or perhaps the entire file system is out of space”, </w:t>
+        <w:t xml:space="preserve"> (8): “Some resource has been exhausted, perhaps a </w:t>
+      </w:r>
+      <w:r>
+        <w:t xml:space="preserve">per-user quota, or perhaps the entire file system is out of space”, </w:t>
       </w:r>
       <w:r>
         <w:rPr>
@@ -32882,10 +32880,7 @@
         <w:t>Protocol Buffers Documentation.</w:t>
       </w:r>
       <w:r>
-        <w:t xml:space="preserve"> </w:t>
-      </w:r>
-      <w:r>
-        <w:t xml:space="preserve">https://protobuf.dev/programming-guides/proto3/ (accessed 2026-10-18). A field number “cannot be changed once your message type is in use” and “should never be reused”; deleted field numbers must be reserved; an unset numeric field reads as zero; the first enum value “must” be zero and is best named </w:t>
+        <w:t xml:space="preserve"> https://protobuf.dev/programming-guides/proto3/ (accessed 2026-10-18). A field number “cannot be changed once your message type is in use” and “should never be reused”; deleted field numbers must be reserved; an unset numeric field reads as zero; the first enum value “must” be zero and is best named </w:t>
       </w:r>
       <w:r>
         <w:rPr>
@@ -32913,10 +32908,10 @@
         <w:t>V</w:t>
       </w:r>
       <w:r>
-        <w:t xml:space="preserve"> M. Thomson, C. Benfield (eds.). “HTTP/2.” RFC 9113, IETF, June 2022 (obsoletes RFC 7540). Abstract: “allowing multiple concurrent exchanges on the same connection”; Section 1: “TCP </w:t>
-      </w:r>
-      <w:r>
-        <w:t>head-of-line blocking is not addressed by this protocol.”</w:t>
+        <w:t xml:space="preserve"> M. Thomson, C. Benfield (eds.). “</w:t>
+      </w:r>
+      <w:r>
+        <w:t>HTTP/2.” RFC 9113, IETF, June 2022 (obsoletes RFC 7540). Abstract: “allowing multiple concurrent exchanges on the same connection”; Section 1: “TCP head-of-line blocking is not addressed by this protocol.”</w:t>
       </w:r>
     </w:p>
     <w:p>
@@ -32964,10 +32959,10 @@
         <w:t>V</w:t>
       </w:r>
       <w:r>
-        <w:t xml:space="preserve"> M. Nottingham, R. Fielding. “Additional HTTP Status Codes.” RFC 6585, IETF, April 2012. Section 4: “</w:t>
-      </w:r>
-      <w:r>
-        <w:t xml:space="preserve">The 429 status code indicates that the user has sent too many requests in a given amount of time (”rate limiting”)“; the response MAY include </w:t>
+        <w:t xml:space="preserve"> </w:t>
+      </w:r>
+      <w:r>
+        <w:t xml:space="preserve">M. Nottingham, R. Fielding. “Additional HTTP Status Codes.” RFC 6585, IETF, April 2012. Section 4: “The 429 status code indicates that the user has sent too many requests in a given amount of time (”rate limiting”)“; the response MAY include </w:t>
       </w:r>
       <w:r>
         <w:rPr>
@@ -32995,7 +32990,10 @@
         <w:t>V</w:t>
       </w:r>
       <w:r>
-        <w:t xml:space="preserve"> J. Heinanen, R. Guerin. “A Single Rate Three Color Marker.” RFC 2697 (Informational), IETF, September 1999. Three parameters, “Committed Information Rate (CIR), Committed Burst Size (CBS), and Excess Burst Size (EBS)”; the meter uses “two token buckets, C and E, which both share the common rate CIR”</w:t>
+        <w:t xml:space="preserve"> J. Heinanen, R. Guerin. “A Single Rate Three Color Marker.” RFC 2697 (Informational), IETF, September 1999. Three parameters, “Committed Information Rate (CIR), Committed Burst Size (CBS), and Excess Burst Size (EBS)”; the meter uses “</w:t>
+      </w:r>
+      <w:r>
+        <w:t>two token buckets, C and E, which both share the common rate CIR”</w:t>
       </w:r>
     </w:p>
     <w:p>
@@ -33042,10 +33040,10 @@
         <w:t>GLOBAL</w:t>
       </w:r>
       <w:r>
-        <w:t xml:space="preserve"> answers on the receiving peer and sends hits to the owner asynchronously: “the use of GLOBAL allows for greater scale but at the cost of consistency”. Production note: “</w:t>
-      </w:r>
-      <w:r>
-        <w:t>a single gubernator node fields over 2,000 requests a second with most batched responses returned in under 1 millisecond”.</w:t>
+        <w:t xml:space="preserve"> answers on the receiving peer and sends hits to the owner asynchronously: “</w:t>
+      </w:r>
+      <w:r>
+        <w:t>the use of GLOBAL allows for greater scale but at the cost of consistency”. Production note: “a single gubernator node fields over 2,000 requests a second with most batched responses returned in under 1 millisecond”.</w:t>
       </w:r>
     </w:p>
     <w:p>
@@ -33110,7 +33108,10 @@
         <w:t>batching()</w:t>
       </w:r>
       <w:r>
-        <w:t xml:space="preserve"> “combines independent requests to same bucket into batches in order to reduce request count to remote storage”; </w:t>
+        <w:t xml:space="preserve"> “combines independent requests to same bucket into batches in order </w:t>
+      </w:r>
+      <w:r>
+        <w:t xml:space="preserve">to reduce request count to remote storage”; </w:t>
       </w:r>
       <w:r>
         <w:rPr>
@@ -33119,10 +33120,7 @@
         <w:t>delaying()</w:t>
       </w:r>
       <w:r>
-        <w:t xml:space="preserve"> “can serve requests locally without </w:t>
-      </w:r>
-      <w:r>
-        <w:t xml:space="preserve">synchronization with external storage until thresholds are not violated”, the thresholds being </w:t>
+        <w:t xml:space="preserve"> “can serve requests locally without synchronization with external storage until thresholds are not violated”, the thresholds being </w:t>
       </w:r>
       <w:r>
         <w:rPr>
@@ -33169,10 +33167,10 @@
         <w:t>Operations Research</w:t>
       </w:r>
       <w:r>
-        <w:t xml:space="preserve"> 9(3), pp. 383–387, 1961. doi:10.1287/opre.9.3.383. The mean number in a system equals the arrival rate </w:t>
-      </w:r>
-      <w:r>
-        <w:t>times the mean time spent in it.</w:t>
+        <w:t xml:space="preserve"> 9(3), </w:t>
+      </w:r>
+      <w:r>
+        <w:t>pp. 383–387, 1961. doi:10.1287/opre.9.3.383. The mean number in a system equals the arrival rate times the mean time spent in it.</w:t>
       </w:r>
     </w:p>
     <w:p>
@@ -33220,7 +33218,10 @@
         <w:t>V</w:t>
       </w:r>
       <w:r>
-        <w:t xml:space="preserve"> B. F. Cooper, A. Silberstein, E. Tam, R. Ramakrishnan, R. Sears. “Benchmarking Cloud Serving Systems with YCSB.” </w:t>
+        <w:t xml:space="preserve"> B. F. Cooper, A. Silberstein, E. Tam, R. Ramakrishnan, R. Sears. “Benchmarking Cloud </w:t>
+      </w:r>
+      <w:r>
+        <w:t xml:space="preserve">Serving Systems with YCSB.” </w:t>
       </w:r>
       <w:r>
         <w:rPr>
@@ -33230,10 +33231,7 @@
         <w:t>Proc. 1st ACM Symposium on Cloud Computing (SoCC ’10)</w:t>
       </w:r>
       <w:r>
-        <w:t xml:space="preserve">, </w:t>
-      </w:r>
-      <w:r>
-        <w:t xml:space="preserve">pp. 143–154, 2010. Zipfian requests: “some records will be extremely popular (the head of the distribution) while most records will be unpopular (the tail)”. The exponent 0.99 is the YCSB tool’s </w:t>
+        <w:t xml:space="preserve">, pp. 143–154, 2010. Zipfian requests: “some records will be extremely popular (the head of the distribution) while most records will be unpopular (the tail)”. The exponent 0.99 is the YCSB tool’s </w:t>
       </w:r>
       <w:r>
         <w:rPr>
@@ -33300,10 +33298,10 @@
         <w:t>V</w:t>
       </w:r>
       <w:r>
-        <w:t xml:space="preserve"> D. Vyukov. “Intrusive MPSC node-based queue.” 1024cores. </w:t>
-      </w:r>
-      <w:r>
-        <w:t xml:space="preserve">http://www.1024cores.net/home/lock-free-algorithms/queues/intrusive-mpsc-node-based-queue (the site redirected away on 2026-10-25). gRPC v1.51.1 credits it in </w:t>
+        <w:t xml:space="preserve"> </w:t>
+      </w:r>
+      <w:r>
+        <w:t xml:space="preserve">D. Vyukov. “Intrusive MPSC node-based queue.” 1024cores. http://www.1024cores.net/home/lock-free-algorithms/queues/intrusive-mpsc-node-based-queue (the site redirected away on 2026-10-25). gRPC v1.51.1 credits it in </w:t>
       </w:r>
       <w:r>
         <w:rPr>
@@ -33374,7 +33372,7 @@
   <w:abstractNum w:abstractNumId="0" w15:restartNumberingAfterBreak="0">
     <w:nsid w:val="0000A990"/>
     <w:multiLevelType w:val="multilevel"/>
-    <w:tmpl w:val="E3EC9910"/>
+    <w:tmpl w:val="AC560994"/>
     <w:lvl w:ilvl="0">
       <w:numFmt w:val="bullet"/>
       <w:lvlText w:val=" "/>
@@ -33451,7 +33449,7 @@
   <w:abstractNum w:abstractNumId="1" w15:restartNumberingAfterBreak="0">
     <w:nsid w:val="0000A991"/>
     <w:multiLevelType w:val="multilevel"/>
-    <w:tmpl w:val="2CA07DBC"/>
+    <w:tmpl w:val="DB82B9E2"/>
     <w:lvl w:ilvl="0">
       <w:numFmt w:val="bullet"/>
       <w:lvlText w:val="•"/>
@@ -33528,7 +33526,7 @@
   <w:abstractNum w:abstractNumId="2" w15:restartNumberingAfterBreak="0">
     <w:nsid w:val="00A99411"/>
     <w:multiLevelType w:val="multilevel"/>
-    <w:tmpl w:val="DE367120"/>
+    <w:tmpl w:val="CFE62CCE"/>
     <w:lvl w:ilvl="0">
       <w:start w:val="1"/>
       <w:numFmt w:val="decimal"/>
@@ -33611,22 +33609,22 @@
       </w:pPr>
     </w:lvl>
   </w:abstractNum>
-  <w:num w:numId="1" w16cid:durableId="502008755">
+  <w:num w:numId="1" w16cid:durableId="858547346">
     <w:abstractNumId w:val="0"/>
   </w:num>
-  <w:num w:numId="2" w16cid:durableId="1835563895">
+  <w:num w:numId="2" w16cid:durableId="164900110">
     <w:abstractNumId w:val="1"/>
   </w:num>
-  <w:num w:numId="3" w16cid:durableId="333387766">
+  <w:num w:numId="3" w16cid:durableId="1310330139">
     <w:abstractNumId w:val="1"/>
   </w:num>
-  <w:num w:numId="4" w16cid:durableId="137109694">
+  <w:num w:numId="4" w16cid:durableId="396973190">
     <w:abstractNumId w:val="1"/>
   </w:num>
-  <w:num w:numId="5" w16cid:durableId="788010905">
+  <w:num w:numId="5" w16cid:durableId="861628222">
     <w:abstractNumId w:val="1"/>
   </w:num>
-  <w:num w:numId="6" w16cid:durableId="1214345032">
+  <w:num w:numId="6" w16cid:durableId="613901178">
     <w:abstractNumId w:val="2"/>
     <w:lvlOverride w:ilvl="0">
       <w:startOverride w:val="1"/>
@@ -33656,7 +33654,7 @@
       <w:startOverride w:val="1"/>
     </w:lvlOverride>
   </w:num>
-  <w:num w:numId="7" w16cid:durableId="510872876">
+  <w:num w:numId="7" w16cid:durableId="458113016">
     <w:abstractNumId w:val="2"/>
     <w:lvlOverride w:ilvl="0">
       <w:startOverride w:val="1"/>
@@ -33686,7 +33684,7 @@
       <w:startOverride w:val="1"/>
     </w:lvlOverride>
   </w:num>
-  <w:num w:numId="8" w16cid:durableId="91512653">
+  <w:num w:numId="8" w16cid:durableId="1141508155">
     <w:abstractNumId w:val="2"/>
     <w:lvlOverride w:ilvl="0">
       <w:startOverride w:val="1"/>
@@ -33716,10 +33714,10 @@
       <w:startOverride w:val="1"/>
     </w:lvlOverride>
   </w:num>
-  <w:num w:numId="9" w16cid:durableId="1336347019">
+  <w:num w:numId="9" w16cid:durableId="1211919838">
     <w:abstractNumId w:val="1"/>
   </w:num>
-  <w:num w:numId="10" w16cid:durableId="1832061196">
+  <w:num w:numId="10" w16cid:durableId="1403991699">
     <w:abstractNumId w:val="2"/>
     <w:lvlOverride w:ilvl="0">
       <w:startOverride w:val="1"/>
@@ -33749,10 +33747,10 @@
       <w:startOverride w:val="1"/>
     </w:lvlOverride>
   </w:num>
-  <w:num w:numId="11" w16cid:durableId="1119491873">
+  <w:num w:numId="11" w16cid:durableId="882207520">
     <w:abstractNumId w:val="1"/>
   </w:num>
-  <w:num w:numId="12" w16cid:durableId="1199971853">
+  <w:num w:numId="12" w16cid:durableId="777525206">
     <w:abstractNumId w:val="2"/>
     <w:lvlOverride w:ilvl="0">
       <w:startOverride w:val="1"/>
@@ -33782,7 +33780,7 @@
       <w:startOverride w:val="1"/>
     </w:lvlOverride>
   </w:num>
-  <w:num w:numId="13" w16cid:durableId="1624189720">
+  <w:num w:numId="13" w16cid:durableId="1819031879">
     <w:abstractNumId w:val="2"/>
     <w:lvlOverride w:ilvl="0">
       <w:startOverride w:val="1"/>
@@ -33812,31 +33810,31 @@
       <w:startOverride w:val="1"/>
     </w:lvlOverride>
   </w:num>
-  <w:num w:numId="14" w16cid:durableId="560168211">
+  <w:num w:numId="14" w16cid:durableId="450436640">
     <w:abstractNumId w:val="1"/>
   </w:num>
-  <w:num w:numId="15" w16cid:durableId="8337542">
+  <w:num w:numId="15" w16cid:durableId="407967305">
     <w:abstractNumId w:val="1"/>
   </w:num>
-  <w:num w:numId="16" w16cid:durableId="1347243806">
+  <w:num w:numId="16" w16cid:durableId="465240728">
     <w:abstractNumId w:val="1"/>
   </w:num>
-  <w:num w:numId="17" w16cid:durableId="345179923">
+  <w:num w:numId="17" w16cid:durableId="1338582077">
     <w:abstractNumId w:val="1"/>
   </w:num>
-  <w:num w:numId="18" w16cid:durableId="1289824766">
+  <w:num w:numId="18" w16cid:durableId="1730035823">
     <w:abstractNumId w:val="1"/>
   </w:num>
-  <w:num w:numId="19" w16cid:durableId="1804301531">
+  <w:num w:numId="19" w16cid:durableId="94985544">
     <w:abstractNumId w:val="1"/>
   </w:num>
-  <w:num w:numId="20" w16cid:durableId="1733113028">
+  <w:num w:numId="20" w16cid:durableId="549223723">
     <w:abstractNumId w:val="1"/>
   </w:num>
-  <w:num w:numId="21" w16cid:durableId="238446598">
+  <w:num w:numId="21" w16cid:durableId="2072346223">
     <w:abstractNumId w:val="1"/>
   </w:num>
-  <w:num w:numId="22" w16cid:durableId="793254848">
+  <w:num w:numId="22" w16cid:durableId="723335617">
     <w:abstractNumId w:val="2"/>
     <w:lvlOverride w:ilvl="0">
       <w:startOverride w:val="1"/>
@@ -33866,133 +33864,133 @@
       <w:startOverride w:val="1"/>
     </w:lvlOverride>
   </w:num>
-  <w:num w:numId="23" w16cid:durableId="958414156">
+  <w:num w:numId="23" w16cid:durableId="1240483949">
     <w:abstractNumId w:val="1"/>
   </w:num>
-  <w:num w:numId="24" w16cid:durableId="182399789">
+  <w:num w:numId="24" w16cid:durableId="2135782722">
     <w:abstractNumId w:val="1"/>
   </w:num>
-  <w:num w:numId="25" w16cid:durableId="628904547">
+  <w:num w:numId="25" w16cid:durableId="1012102289">
     <w:abstractNumId w:val="1"/>
   </w:num>
-  <w:num w:numId="26" w16cid:durableId="795803813">
+  <w:num w:numId="26" w16cid:durableId="1933276175">
     <w:abstractNumId w:val="1"/>
   </w:num>
-  <w:num w:numId="27" w16cid:durableId="1379739747">
+  <w:num w:numId="27" w16cid:durableId="1890680137">
     <w:abstractNumId w:val="1"/>
   </w:num>
-  <w:num w:numId="28" w16cid:durableId="874926964">
+  <w:num w:numId="28" w16cid:durableId="297536073">
     <w:abstractNumId w:val="1"/>
   </w:num>
-  <w:num w:numId="29" w16cid:durableId="859780992">
+  <w:num w:numId="29" w16cid:durableId="1881430931">
     <w:abstractNumId w:val="1"/>
   </w:num>
-  <w:num w:numId="30" w16cid:durableId="2004237211">
+  <w:num w:numId="30" w16cid:durableId="1871141412">
     <w:abstractNumId w:val="1"/>
   </w:num>
-  <w:num w:numId="31" w16cid:durableId="794103637">
+  <w:num w:numId="31" w16cid:durableId="838811697">
     <w:abstractNumId w:val="1"/>
   </w:num>
-  <w:num w:numId="32" w16cid:durableId="1587962517">
+  <w:num w:numId="32" w16cid:durableId="27688025">
     <w:abstractNumId w:val="1"/>
   </w:num>
-  <w:num w:numId="33" w16cid:durableId="95909387">
+  <w:num w:numId="33" w16cid:durableId="1720275044">
     <w:abstractNumId w:val="1"/>
   </w:num>
-  <w:num w:numId="34" w16cid:durableId="1824275220">
+  <w:num w:numId="34" w16cid:durableId="2091385497">
     <w:abstractNumId w:val="1"/>
   </w:num>
-  <w:num w:numId="35" w16cid:durableId="1958952293">
+  <w:num w:numId="35" w16cid:durableId="23872686">
     <w:abstractNumId w:val="1"/>
   </w:num>
-  <w:num w:numId="36" w16cid:durableId="990449958">
+  <w:num w:numId="36" w16cid:durableId="1666859821">
     <w:abstractNumId w:val="1"/>
   </w:num>
-  <w:num w:numId="37" w16cid:durableId="471602156">
+  <w:num w:numId="37" w16cid:durableId="1302417201">
     <w:abstractNumId w:val="1"/>
   </w:num>
-  <w:num w:numId="38" w16cid:durableId="1281112620">
+  <w:num w:numId="38" w16cid:durableId="1278830580">
     <w:abstractNumId w:val="1"/>
   </w:num>
-  <w:num w:numId="39" w16cid:durableId="30151884">
+  <w:num w:numId="39" w16cid:durableId="1727294752">
     <w:abstractNumId w:val="1"/>
   </w:num>
-  <w:num w:numId="40" w16cid:durableId="1339424943">
+  <w:num w:numId="40" w16cid:durableId="1012876820">
     <w:abstractNumId w:val="1"/>
   </w:num>
-  <w:num w:numId="41" w16cid:durableId="1239174608">
+  <w:num w:numId="41" w16cid:durableId="1798060199">
     <w:abstractNumId w:val="1"/>
   </w:num>
-  <w:num w:numId="42" w16cid:durableId="1939369745">
+  <w:num w:numId="42" w16cid:durableId="215630422">
     <w:abstractNumId w:val="1"/>
   </w:num>
-  <w:num w:numId="43" w16cid:durableId="1371226765">
+  <w:num w:numId="43" w16cid:durableId="699084669">
     <w:abstractNumId w:val="1"/>
   </w:num>
-  <w:num w:numId="44" w16cid:durableId="1212231902">
+  <w:num w:numId="44" w16cid:durableId="160856687">
     <w:abstractNumId w:val="1"/>
   </w:num>
-  <w:num w:numId="45" w16cid:durableId="1569684906">
+  <w:num w:numId="45" w16cid:durableId="1532035832">
     <w:abstractNumId w:val="1"/>
   </w:num>
-  <w:num w:numId="46" w16cid:durableId="38555798">
+  <w:num w:numId="46" w16cid:durableId="754789986">
     <w:abstractNumId w:val="1"/>
   </w:num>
-  <w:num w:numId="47" w16cid:durableId="1549879969">
+  <w:num w:numId="47" w16cid:durableId="995189747">
     <w:abstractNumId w:val="1"/>
   </w:num>
-  <w:num w:numId="48" w16cid:durableId="374550284">
+  <w:num w:numId="48" w16cid:durableId="984746773">
     <w:abstractNumId w:val="1"/>
   </w:num>
-  <w:num w:numId="49" w16cid:durableId="248658640">
+  <w:num w:numId="49" w16cid:durableId="1032075687">
     <w:abstractNumId w:val="1"/>
   </w:num>
-  <w:num w:numId="50" w16cid:durableId="1058213155">
+  <w:num w:numId="50" w16cid:durableId="918518445">
     <w:abstractNumId w:val="1"/>
   </w:num>
-  <w:num w:numId="51" w16cid:durableId="1742411162">
+  <w:num w:numId="51" w16cid:durableId="2139447199">
     <w:abstractNumId w:val="1"/>
   </w:num>
-  <w:num w:numId="52" w16cid:durableId="963274056">
+  <w:num w:numId="52" w16cid:durableId="846559421">
     <w:abstractNumId w:val="1"/>
   </w:num>
-  <w:num w:numId="53" w16cid:durableId="500661008">
+  <w:num w:numId="53" w16cid:durableId="338580012">
     <w:abstractNumId w:val="1"/>
   </w:num>
-  <w:num w:numId="54" w16cid:durableId="514222737">
+  <w:num w:numId="54" w16cid:durableId="1714310619">
     <w:abstractNumId w:val="1"/>
   </w:num>
-  <w:num w:numId="55" w16cid:durableId="500268800">
+  <w:num w:numId="55" w16cid:durableId="793599002">
     <w:abstractNumId w:val="1"/>
   </w:num>
-  <w:num w:numId="56" w16cid:durableId="403798478">
+  <w:num w:numId="56" w16cid:durableId="1364941870">
     <w:abstractNumId w:val="1"/>
   </w:num>
-  <w:num w:numId="57" w16cid:durableId="2058971087">
+  <w:num w:numId="57" w16cid:durableId="1571188058">
     <w:abstractNumId w:val="1"/>
   </w:num>
-  <w:num w:numId="58" w16cid:durableId="127167383">
+  <w:num w:numId="58" w16cid:durableId="2015256314">
     <w:abstractNumId w:val="1"/>
   </w:num>
-  <w:num w:numId="59" w16cid:durableId="1518159081">
+  <w:num w:numId="59" w16cid:durableId="1560360840">
     <w:abstractNumId w:val="1"/>
   </w:num>
-  <w:num w:numId="60" w16cid:durableId="924848060">
+  <w:num w:numId="60" w16cid:durableId="1726490355">
     <w:abstractNumId w:val="1"/>
   </w:num>
-  <w:num w:numId="61" w16cid:durableId="882597187">
+  <w:num w:numId="61" w16cid:durableId="1616255297">
     <w:abstractNumId w:val="1"/>
   </w:num>
-  <w:num w:numId="62" w16cid:durableId="120080693">
+  <w:num w:numId="62" w16cid:durableId="1186822385">
     <w:abstractNumId w:val="1"/>
   </w:num>
-  <w:num w:numId="63" w16cid:durableId="492525493">
+  <w:num w:numId="63" w16cid:durableId="1796409887">
     <w:abstractNumId w:val="1"/>
   </w:num>
-  <w:num w:numId="64" w16cid:durableId="1001355907">
+  <w:num w:numId="64" w16cid:durableId="1689715820">
     <w:abstractNumId w:val="1"/>
   </w:num>
-  <w:num w:numId="65" w16cid:durableId="258494136">
+  <w:num w:numId="65" w16cid:durableId="1002471107">
     <w:abstractNumId w:val="2"/>
     <w:lvlOverride w:ilvl="0">
       <w:startOverride w:val="1"/>
@@ -35074,7 +35072,7 @@
     <w:next w:val="Normal"/>
     <w:autoRedefine/>
     <w:uiPriority w:val="39"/>
-    <w:rsid w:val="00CB29F9"/>
+    <w:rsid w:val="00E17EB7"/>
     <w:pPr>
       <w:spacing w:after="100"/>
     </w:pPr>
@@ -35085,7 +35083,7 @@
     <w:next w:val="Normal"/>
     <w:autoRedefine/>
     <w:uiPriority w:val="39"/>
-    <w:rsid w:val="00CB29F9"/>
+    <w:rsid w:val="00E17EB7"/>
     <w:pPr>
       <w:spacing w:after="100"/>
       <w:ind w:left="240"/>

</xml_diff>